<commit_message>
Move Executive Command Center to the final training exercise
Renumber exercises and update the workshop documents, decks, and artwork. Keep the screenshot-based cost review in the new first exercise, Deep Research.

Co-authored-by: Copilot <223556219+Copilot@users.noreply.github.com>
</commit_message>
<xml_diff>
--- a/reference/00-copilot-vs-cowork.docx
+++ b/reference/00-copilot-vs-cowork.docx
@@ -1,14 +1,14 @@
 
 <file path=word/document.xml><?xml version="1.0" encoding="utf-8"?>
-<w:document xmlns:wpc="http://schemas.microsoft.com/office/word/2010/wordprocessingCanvas" xmlns:cx="http://schemas.microsoft.com/office/drawing/2014/chartex" xmlns:cx1="http://schemas.microsoft.com/office/drawing/2015/9/8/chartex" xmlns:cx2="http://schemas.microsoft.com/office/drawing/2015/10/21/chartex" xmlns:cx3="http://schemas.microsoft.com/office/drawing/2016/5/9/chartex" xmlns:cx4="http://schemas.microsoft.com/office/drawing/2016/5/10/chartex" xmlns:cx5="http://schemas.microsoft.com/office/drawing/2016/5/11/chartex" xmlns:cx6="http://schemas.microsoft.com/office/drawing/2016/5/12/chartex" xmlns:cx7="http://schemas.microsoft.com/office/drawing/2016/5/13/chartex" xmlns:cx8="http://schemas.microsoft.com/office/drawing/2016/5/14/chartex" xmlns:mc="http://schemas.openxmlformats.org/markup-compatibility/2006" xmlns:aink="http://schemas.microsoft.com/office/drawing/2016/ink" xmlns:am3d="http://schemas.microsoft.com/office/drawing/2017/model3d" xmlns:o="urn:schemas-microsoft-com:office:office" xmlns:oel="http://schemas.microsoft.com/office/2019/extlst" xmlns:r="http://schemas.openxmlformats.org/officeDocument/2006/relationships" xmlns:m="http://schemas.openxmlformats.org/officeDocument/2006/math" xmlns:v="urn:schemas-microsoft-com:vml" xmlns:wp14="http://schemas.microsoft.com/office/word/2010/wordprocessingDrawing" xmlns:wp="http://schemas.openxmlformats.org/drawingml/2006/wordprocessingDrawing" xmlns:w10="urn:schemas-microsoft-com:office:word" xmlns:w="http://schemas.openxmlformats.org/wordprocessingml/2006/main" xmlns:w14="http://schemas.microsoft.com/office/word/2010/wordml" xmlns:w15="http://schemas.microsoft.com/office/word/2012/wordml" xmlns:w16cex="http://schemas.microsoft.com/office/word/2018/wordml/cex" xmlns:w16cid="http://schemas.microsoft.com/office/word/2016/wordml/cid" xmlns:w16="http://schemas.microsoft.com/office/word/2018/wordml" xmlns:w16du="http://schemas.microsoft.com/office/word/2023/wordml/word16du" xmlns:w16sdtdh="http://schemas.microsoft.com/office/word/2020/wordml/sdtdatahash" xmlns:w16sdtfl="http://schemas.microsoft.com/office/word/2024/wordml/sdtformatlock" xmlns:w16se="http://schemas.microsoft.com/office/word/2015/wordml/symex" xmlns:wpg="http://schemas.microsoft.com/office/word/2010/wordprocessingGroup" xmlns:wpi="http://schemas.microsoft.com/office/word/2010/wordprocessingInk" xmlns:wne="http://schemas.microsoft.com/office/word/2006/wordml" xmlns:wps="http://schemas.microsoft.com/office/word/2010/wordprocessingShape" mc:Ignorable="w14 w15 w16se w16cid w16 w16cex w16sdtdh w16sdtfl w16du wp14">
+<w:document xmlns:w="http://schemas.openxmlformats.org/wordprocessingml/2006/main" xmlns:m="http://schemas.openxmlformats.org/officeDocument/2006/math" xmlns:r="http://schemas.openxmlformats.org/officeDocument/2006/relationships" xmlns:o="urn:schemas-microsoft-com:office:office" xmlns:v="urn:schemas-microsoft-com:vml" xmlns:w10="urn:schemas-microsoft-com:office:word" xmlns:a="http://schemas.openxmlformats.org/drawingml/2006/main" xmlns:pic="http://schemas.openxmlformats.org/drawingml/2006/picture" xmlns:wp="http://schemas.openxmlformats.org/drawingml/2006/wordprocessingDrawing">
   <w:body>
+    <w:bookmarkStart w:id="15" w:name="Xd37363a87cec5dd85c5a4982c444d19dd61c1d7"/>
     <w:p>
       <w:pPr>
         <w:pStyle w:val="Heading1"/>
       </w:pPr>
-      <w:bookmarkStart w:id="0" w:name="Xd37363a87cec5dd85c5a4982c444d19dd61c1d7"/>
-      <w:r>
-        <w:t>00 · Copilot vs. Cowork — What's the Difference?</w:t>
+      <w:r>
+        <w:t xml:space="preserve">00 · Copilot vs. Cowork — What's the Difference?</w:t>
       </w:r>
     </w:p>
     <w:p>
@@ -22,26 +22,38 @@
         <w:ind w:left="288" w:right="144"/>
       </w:pPr>
       <w:r>
-        <w:t xml:space="preserve">Reference sheet for the "Getting Things Done with Copilot Cowork for HR Tasks" workshop. This is where the training </w:t>
+        <w:t xml:space="preserve">Reference sheet for the "Getting Things Done with Copilot Cowork for HR Tasks" workshop.</w:t>
+      </w:r>
+      <w:r>
+        <w:t xml:space="preserve"> </w:t>
+      </w:r>
+      <w:r>
+        <w:t xml:space="preserve">This is where the training</w:t>
+      </w:r>
+      <w:r>
+        <w:t xml:space="preserve"> </w:t>
       </w:r>
       <w:r>
         <w:rPr>
           <w:b/>
           <w:bCs/>
         </w:rPr>
-        <w:t>starts</w:t>
-      </w:r>
-      <w:r>
-        <w:t xml:space="preserve"> — get the mental model right before touching the product.</w:t>
+        <w:t xml:space="preserve">starts</w:t>
+      </w:r>
+      <w:r>
+        <w:t xml:space="preserve"> </w:t>
+      </w:r>
+      <w:r>
+        <w:t xml:space="preserve">— get the mental model right before touching the product.</w:t>
       </w:r>
     </w:p>
+    <w:bookmarkStart w:id="9" w:name="the-one-sentence-difference"/>
     <w:p>
       <w:pPr>
         <w:pStyle w:val="Heading2"/>
       </w:pPr>
-      <w:bookmarkStart w:id="1" w:name="the-one-sentence-difference"/>
-      <w:r>
-        <w:t>The one-sentence difference</w:t>
+      <w:r>
+        <w:t xml:space="preserve">The one-sentence difference</w:t>
       </w:r>
     </w:p>
     <w:p>
@@ -49,7 +61,7 @@
         <w:pStyle w:val="Compact"/>
         <w:numPr>
           <w:ilvl w:val="0"/>
-          <w:numId w:val="2"/>
+          <w:numId w:val="1001"/>
         </w:numPr>
       </w:pPr>
       <w:r>
@@ -57,20 +69,35 @@
           <w:b/>
           <w:bCs/>
         </w:rPr>
-        <w:t>Microsoft 365 Copilot (Chat)</w:t>
-      </w:r>
-      <w:r>
-        <w:t xml:space="preserve"> is your </w:t>
+        <w:t xml:space="preserve">Microsoft 365 Copilot (Chat)</w:t>
+      </w:r>
+      <w:r>
+        <w:t xml:space="preserve"> </w:t>
+      </w:r>
+      <w:r>
+        <w:t xml:space="preserve">is your</w:t>
+      </w:r>
+      <w:r>
+        <w:t xml:space="preserve"> </w:t>
       </w:r>
       <w:r>
         <w:rPr>
           <w:b/>
           <w:bCs/>
         </w:rPr>
-        <w:t>AI assistant</w:t>
-      </w:r>
-      <w:r>
-        <w:t xml:space="preserve"> — you ask, it answers, and you stay in control of each step.</w:t>
+        <w:t xml:space="preserve">AI assistant</w:t>
+      </w:r>
+      <w:r>
+        <w:t xml:space="preserve"> </w:t>
+      </w:r>
+      <w:r>
+        <w:t xml:space="preserve">— you ask, it answers, and you stay in</w:t>
+      </w:r>
+      <w:r>
+        <w:t xml:space="preserve"> </w:t>
+      </w:r>
+      <w:r>
+        <w:t xml:space="preserve">control of each step.</w:t>
       </w:r>
     </w:p>
     <w:p>
@@ -78,7 +105,7 @@
         <w:pStyle w:val="Compact"/>
         <w:numPr>
           <w:ilvl w:val="0"/>
-          <w:numId w:val="2"/>
+          <w:numId w:val="1001"/>
         </w:numPr>
       </w:pPr>
       <w:r>
@@ -86,33 +113,48 @@
           <w:b/>
           <w:bCs/>
         </w:rPr>
-        <w:t>Copilot Cowork</w:t>
-      </w:r>
-      <w:r>
-        <w:t xml:space="preserve"> is your </w:t>
+        <w:t xml:space="preserve">Copilot Cowork</w:t>
+      </w:r>
+      <w:r>
+        <w:t xml:space="preserve"> </w:t>
+      </w:r>
+      <w:r>
+        <w:t xml:space="preserve">is your</w:t>
+      </w:r>
+      <w:r>
+        <w:t xml:space="preserve"> </w:t>
       </w:r>
       <w:r>
         <w:rPr>
           <w:b/>
           <w:bCs/>
         </w:rPr>
-        <w:t>AI coworker</w:t>
-      </w:r>
-      <w:r>
-        <w:t xml:space="preserve"> — you describe an </w:t>
+        <w:t xml:space="preserve">AI coworker</w:t>
+      </w:r>
+      <w:r>
+        <w:t xml:space="preserve"> </w:t>
+      </w:r>
+      <w:r>
+        <w:t xml:space="preserve">— you describe an</w:t>
+      </w:r>
+      <w:r>
+        <w:t xml:space="preserve"> </w:t>
       </w:r>
       <w:r>
         <w:rPr>
           <w:b/>
           <w:bCs/>
         </w:rPr>
-        <w:t>outcome</w:t>
-      </w:r>
-      <w:r>
-        <w:t xml:space="preserve">, and it plans the steps, </w:t>
-      </w:r>
-      <w:r>
-        <w:t>picks the skills, does the multi-step work, and hands back a finished artifact for your review.</w:t>
+        <w:t xml:space="preserve">outcome</w:t>
+      </w:r>
+      <w:r>
+        <w:t xml:space="preserve">, and it plans the steps,</w:t>
+      </w:r>
+      <w:r>
+        <w:t xml:space="preserve"> </w:t>
+      </w:r>
+      <w:r>
+        <w:t xml:space="preserve">picks the skills, does the multi-step work, and hands back a finished artifact for your review.</w:t>
       </w:r>
     </w:p>
     <w:p>
@@ -120,33 +162,46 @@
         <w:pStyle w:val="FirstParagraph"/>
       </w:pPr>
       <w:r>
-        <w:t xml:space="preserve">Think: </w:t>
+        <w:t xml:space="preserve">Think:</w:t>
+      </w:r>
+      <w:r>
+        <w:t xml:space="preserve"> </w:t>
       </w:r>
       <w:r>
         <w:rPr>
           <w:b/>
           <w:bCs/>
         </w:rPr>
-        <w:t>Copilot helps you do the work. Cowork does the work for you</w:t>
-      </w:r>
-      <w:r>
-        <w:t xml:space="preserve"> (with your approval at the key moments).</w:t>
+        <w:t xml:space="preserve">Copilot helps you do the work. Cowork does the work for you</w:t>
+      </w:r>
+      <w:r>
+        <w:t xml:space="preserve"> </w:t>
+      </w:r>
+      <w:r>
+        <w:t xml:space="preserve">(with your approval at the</w:t>
+      </w:r>
+      <w:r>
+        <w:t xml:space="preserve"> </w:t>
+      </w:r>
+      <w:r>
+        <w:t xml:space="preserve">key moments).</w:t>
       </w:r>
     </w:p>
+    <w:bookmarkEnd w:id="9"/>
+    <w:bookmarkStart w:id="10" w:name="side-by-side"/>
     <w:p>
       <w:pPr>
         <w:pStyle w:val="Heading2"/>
       </w:pPr>
-      <w:bookmarkStart w:id="2" w:name="side-by-side"/>
-      <w:bookmarkEnd w:id="1"/>
-      <w:r>
-        <w:t>Side-by-side</w:t>
+      <w:r>
+        <w:t xml:space="preserve">Side-by-side</w:t>
       </w:r>
     </w:p>
     <w:tbl>
       <w:tblPr>
         <w:tblStyle w:val="Table"/>
-        <w:tblW w:w="0" w:type="auto"/>
+        <w:tblW w:type="auto" w:w="0"/>
+        <w:tblLook w:firstRow="1" w:lastRow="0" w:firstColumn="0" w:lastColumn="0" w:noHBand="0" w:noVBand="0" w:val="0020"/>
         <w:tblBorders>
           <w:top w:val="single" w:sz="4" w:space="0" w:color="D1D1D1"/>
           <w:left w:val="single" w:sz="4" w:space="0" w:color="D1D1D1"/>
@@ -161,39 +216,35 @@
           <w:bottom w:w="40" w:type="dxa"/>
           <w:right w:w="90" w:type="dxa"/>
         </w:tblCellMar>
-        <w:tblLook w:val="0020" w:firstRow="1" w:lastRow="0" w:firstColumn="0" w:lastColumn="0" w:noHBand="0" w:noVBand="0"/>
       </w:tblPr>
       <w:tblGrid>
-        <w:gridCol w:w="1746"/>
-        <w:gridCol w:w="2772"/>
-        <w:gridCol w:w="5454"/>
+        <w:gridCol w:w="2640"/>
+        <w:gridCol w:w="2640"/>
+        <w:gridCol w:w="2640"/>
       </w:tblGrid>
       <w:tr>
         <w:trPr>
-          <w:cnfStyle w:val="100000000000" w:firstRow="1" w:lastRow="0" w:firstColumn="0" w:lastColumn="0" w:oddVBand="0" w:evenVBand="0" w:oddHBand="0" w:evenHBand="0" w:firstRowFirstColumn="0" w:firstRowLastColumn="0" w:lastRowFirstColumn="0" w:lastRowLastColumn="0"/>
-          <w:tblHeader/>
+          <w:tblHeader w:val="on"/>
         </w:trPr>
         <w:tc>
           <w:tcPr>
-            <w:tcW w:w="0" w:type="auto"/>
             <w:shd w:val="clear" w:color="auto" w:fill="F3E5FD"/>
           </w:tcPr>
           <w:p>
             <w:pPr>
               <w:pStyle w:val="Compact"/>
-              <w:spacing w:before="20" w:after="20"/>
+              <w:spacing w:after="20" w:before="20"/>
             </w:pPr>
           </w:p>
         </w:tc>
         <w:tc>
           <w:tcPr>
-            <w:tcW w:w="0" w:type="auto"/>
             <w:shd w:val="clear" w:color="auto" w:fill="F3E5FD"/>
           </w:tcPr>
           <w:p>
             <w:pPr>
               <w:pStyle w:val="Compact"/>
-              <w:spacing w:before="20" w:after="20"/>
+              <w:spacing w:after="20" w:before="20"/>
             </w:pPr>
             <w:r>
               <w:rPr>
@@ -201,19 +252,18 @@
                 <w:bCs/>
                 <w:sz w:val="19"/>
               </w:rPr>
-              <w:t>Copilot (Chat)</w:t>
+              <w:t xml:space="preserve">Copilot (Chat)</w:t>
             </w:r>
           </w:p>
         </w:tc>
         <w:tc>
           <w:tcPr>
-            <w:tcW w:w="0" w:type="auto"/>
             <w:shd w:val="clear" w:color="auto" w:fill="F3E5FD"/>
           </w:tcPr>
           <w:p>
             <w:pPr>
               <w:pStyle w:val="Compact"/>
-              <w:spacing w:before="20" w:after="20"/>
+              <w:spacing w:after="20" w:before="20"/>
             </w:pPr>
             <w:r>
               <w:rPr>
@@ -221,143 +271,127 @@
                 <w:bCs/>
                 <w:sz w:val="19"/>
               </w:rPr>
-              <w:t>Copilot Cowork</w:t>
+              <w:t xml:space="preserve">Copilot Cowork</w:t>
             </w:r>
           </w:p>
         </w:tc>
       </w:tr>
       <w:tr>
         <w:tc>
-          <w:tcPr>
-            <w:tcW w:w="0" w:type="auto"/>
-          </w:tcPr>
+          <w:tcPr/>
           <w:p>
             <w:pPr>
               <w:pStyle w:val="Compact"/>
-              <w:spacing w:before="20" w:after="20"/>
+              <w:spacing w:after="20" w:before="20"/>
             </w:pPr>
             <w:r>
               <w:rPr>
                 <w:sz w:val="19"/>
               </w:rPr>
-              <w:t>Best for</w:t>
+              <w:t xml:space="preserve">Best for</w:t>
             </w:r>
           </w:p>
         </w:tc>
         <w:tc>
-          <w:tcPr>
-            <w:tcW w:w="0" w:type="auto"/>
-          </w:tcPr>
+          <w:tcPr/>
           <w:p>
             <w:pPr>
               <w:pStyle w:val="Compact"/>
-              <w:spacing w:before="20" w:after="20"/>
+              <w:spacing w:after="20" w:before="20"/>
             </w:pPr>
             <w:r>
               <w:rPr>
                 <w:sz w:val="19"/>
               </w:rPr>
-              <w:t>Quick answers, drafting, summarizing, rewriting</w:t>
+              <w:t xml:space="preserve">Quick answers, drafting, summarizing, rewriting</w:t>
             </w:r>
           </w:p>
         </w:tc>
         <w:tc>
-          <w:tcPr>
-            <w:tcW w:w="0" w:type="auto"/>
-          </w:tcPr>
+          <w:tcPr/>
           <w:p>
             <w:pPr>
               <w:pStyle w:val="Compact"/>
-              <w:spacing w:before="20" w:after="20"/>
+              <w:spacing w:after="20" w:before="20"/>
             </w:pPr>
             <w:r>
               <w:rPr>
                 <w:sz w:val="19"/>
               </w:rPr>
-              <w:t>Multi-step tasks that end in a deliverable</w:t>
+              <w:t xml:space="preserve">Multi-step tasks that end in a deliverable</w:t>
             </w:r>
           </w:p>
         </w:tc>
       </w:tr>
       <w:tr>
         <w:tc>
-          <w:tcPr>
-            <w:tcW w:w="0" w:type="auto"/>
-          </w:tcPr>
+          <w:tcPr/>
           <w:p>
             <w:pPr>
               <w:pStyle w:val="Compact"/>
-              <w:spacing w:before="20" w:after="20"/>
+              <w:spacing w:after="20" w:before="20"/>
             </w:pPr>
             <w:r>
               <w:rPr>
                 <w:sz w:val="19"/>
               </w:rPr>
-              <w:t>Interaction</w:t>
+              <w:t xml:space="preserve">Interaction</w:t>
             </w:r>
           </w:p>
         </w:tc>
         <w:tc>
-          <w:tcPr>
-            <w:tcW w:w="0" w:type="auto"/>
-          </w:tcPr>
+          <w:tcPr/>
           <w:p>
             <w:pPr>
               <w:pStyle w:val="Compact"/>
-              <w:spacing w:before="20" w:after="20"/>
+              <w:spacing w:after="20" w:before="20"/>
             </w:pPr>
             <w:r>
               <w:rPr>
                 <w:sz w:val="19"/>
               </w:rPr>
-              <w:t>Turn-by-turn conversation</w:t>
+              <w:t xml:space="preserve">Turn-by-turn conversation</w:t>
             </w:r>
           </w:p>
         </w:tc>
         <w:tc>
-          <w:tcPr>
-            <w:tcW w:w="0" w:type="auto"/>
-          </w:tcPr>
+          <w:tcPr/>
           <w:p>
             <w:pPr>
               <w:pStyle w:val="Compact"/>
-              <w:spacing w:before="20" w:after="20"/>
+              <w:spacing w:after="20" w:before="20"/>
             </w:pPr>
             <w:r>
               <w:rPr>
                 <w:sz w:val="19"/>
               </w:rPr>
-              <w:t>Describe the outcome; it runs the plan</w:t>
+              <w:t xml:space="preserve">Describe the outcome; it runs the plan</w:t>
             </w:r>
           </w:p>
         </w:tc>
       </w:tr>
       <w:tr>
         <w:tc>
-          <w:tcPr>
-            <w:tcW w:w="0" w:type="auto"/>
-          </w:tcPr>
+          <w:tcPr/>
           <w:p>
             <w:pPr>
               <w:pStyle w:val="Compact"/>
-              <w:spacing w:before="20" w:after="20"/>
+              <w:spacing w:after="20" w:before="20"/>
             </w:pPr>
             <w:r>
               <w:rPr>
                 <w:sz w:val="19"/>
               </w:rPr>
-              <w:t>Who drives</w:t>
+              <w:t xml:space="preserve">Who drives</w:t>
             </w:r>
           </w:p>
         </w:tc>
         <w:tc>
-          <w:tcPr>
-            <w:tcW w:w="0" w:type="auto"/>
-          </w:tcPr>
+          <w:tcPr/>
           <w:p>
             <w:pPr>
               <w:pStyle w:val="Compact"/>
-              <w:spacing w:before="20" w:after="20"/>
+              <w:spacing w:after="20" w:before="20"/>
             </w:pPr>
             <w:r>
               <w:rPr>
@@ -365,24 +399,22 @@
                 <w:bCs/>
                 <w:sz w:val="19"/>
               </w:rPr>
-              <w:t>You</w:t>
-            </w:r>
-            <w:r>
-              <w:rPr>
-                <w:sz w:val="19"/>
-              </w:rPr>
-              <w:t>, step by step</w:t>
+              <w:t xml:space="preserve">You</w:t>
+            </w:r>
+            <w:r>
+              <w:rPr>
+                <w:sz w:val="19"/>
+              </w:rPr>
+              <w:t xml:space="preserve">, step by step</w:t>
             </w:r>
           </w:p>
         </w:tc>
         <w:tc>
-          <w:tcPr>
-            <w:tcW w:w="0" w:type="auto"/>
-          </w:tcPr>
+          <w:tcPr/>
           <w:p>
             <w:pPr>
               <w:pStyle w:val="Compact"/>
-              <w:spacing w:before="20" w:after="20"/>
+              <w:spacing w:after="20" w:before="20"/>
             </w:pPr>
             <w:r>
               <w:rPr>
@@ -390,7 +422,7 @@
                 <w:bCs/>
                 <w:sz w:val="19"/>
               </w:rPr>
-              <w:t>Cowork</w:t>
+              <w:t xml:space="preserve">Cowork</w:t>
             </w:r>
             <w:r>
               <w:rPr>
@@ -402,166 +434,154 @@
               <w:rPr>
                 <w:sz w:val="19"/>
               </w:rPr>
-              <w:t>plans &amp; executes; you approve checkpoints</w:t>
+              <w:t xml:space="preserve">plans &amp; executes; you approve checkpoints</w:t>
             </w:r>
           </w:p>
         </w:tc>
       </w:tr>
       <w:tr>
         <w:tc>
-          <w:tcPr>
-            <w:tcW w:w="0" w:type="auto"/>
-          </w:tcPr>
+          <w:tcPr/>
           <w:p>
             <w:pPr>
               <w:pStyle w:val="Compact"/>
-              <w:spacing w:before="20" w:after="20"/>
+              <w:spacing w:after="20" w:before="20"/>
             </w:pPr>
             <w:r>
               <w:rPr>
                 <w:sz w:val="19"/>
               </w:rPr>
-              <w:t>Output</w:t>
+              <w:t xml:space="preserve">Output</w:t>
             </w:r>
           </w:p>
         </w:tc>
         <w:tc>
-          <w:tcPr>
-            <w:tcW w:w="0" w:type="auto"/>
-          </w:tcPr>
+          <w:tcPr/>
           <w:p>
             <w:pPr>
               <w:pStyle w:val="Compact"/>
-              <w:spacing w:before="20" w:after="20"/>
+              <w:spacing w:after="20" w:before="20"/>
             </w:pPr>
             <w:r>
               <w:rPr>
                 <w:sz w:val="19"/>
               </w:rPr>
-              <w:t>A response in the chat</w:t>
+              <w:t xml:space="preserve">A response in the chat</w:t>
             </w:r>
           </w:p>
         </w:tc>
         <w:tc>
-          <w:tcPr>
-            <w:tcW w:w="0" w:type="auto"/>
-          </w:tcPr>
+          <w:tcPr/>
           <w:p>
             <w:pPr>
               <w:pStyle w:val="Compact"/>
-              <w:spacing w:before="20" w:after="20"/>
+              <w:spacing w:after="20" w:before="20"/>
             </w:pPr>
             <w:r>
               <w:rPr>
                 <w:sz w:val="19"/>
               </w:rPr>
-              <w:t>Finished artifacts: doc, deck, email, report, schedule</w:t>
+              <w:t xml:space="preserve">Finished artifacts: doc, deck, email, report, schedule</w:t>
             </w:r>
           </w:p>
         </w:tc>
       </w:tr>
       <w:tr>
         <w:tc>
-          <w:tcPr>
-            <w:tcW w:w="0" w:type="auto"/>
-          </w:tcPr>
+          <w:tcPr/>
           <w:p>
             <w:pPr>
               <w:pStyle w:val="Compact"/>
-              <w:spacing w:before="20" w:after="20"/>
+              <w:spacing w:after="20" w:before="20"/>
             </w:pPr>
             <w:r>
               <w:rPr>
                 <w:sz w:val="19"/>
               </w:rPr>
-              <w:t>Runs across</w:t>
+              <w:t xml:space="preserve">Runs across</w:t>
             </w:r>
           </w:p>
         </w:tc>
         <w:tc>
-          <w:tcPr>
-            <w:tcW w:w="0" w:type="auto"/>
-          </w:tcPr>
+          <w:tcPr/>
           <w:p>
             <w:pPr>
               <w:pStyle w:val="Compact"/>
-              <w:spacing w:before="20" w:after="20"/>
+              <w:spacing w:after="20" w:before="20"/>
             </w:pPr>
             <w:r>
               <w:rPr>
                 <w:sz w:val="19"/>
               </w:rPr>
-              <w:t>Your M365 apps as an assistant</w:t>
+              <w:t xml:space="preserve">Your M365 apps as an assistant</w:t>
             </w:r>
           </w:p>
         </w:tc>
         <w:tc>
-          <w:tcPr>
-            <w:tcW w:w="0" w:type="auto"/>
-          </w:tcPr>
+          <w:tcPr/>
           <w:p>
             <w:pPr>
               <w:pStyle w:val="Compact"/>
-              <w:spacing w:before="20" w:after="20"/>
+              <w:spacing w:after="20" w:before="20"/>
             </w:pPr>
             <w:r>
               <w:rPr>
                 <w:sz w:val="19"/>
               </w:rPr>
-              <w:t>Skills + apps orchestrated for you (Work IQ)</w:t>
+              <w:t xml:space="preserve">Skills + apps orchestrated for you (Work IQ)</w:t>
             </w:r>
           </w:p>
         </w:tc>
       </w:tr>
       <w:tr>
         <w:tc>
-          <w:tcPr>
-            <w:tcW w:w="0" w:type="auto"/>
-          </w:tcPr>
+          <w:tcPr/>
           <w:p>
             <w:pPr>
               <w:pStyle w:val="Compact"/>
-              <w:spacing w:before="20" w:after="20"/>
+              <w:spacing w:after="20" w:before="20"/>
             </w:pPr>
             <w:r>
               <w:rPr>
                 <w:sz w:val="19"/>
               </w:rPr>
-              <w:t>Long-running / scheduled</w:t>
+              <w:t xml:space="preserve">Long-running / scheduled</w:t>
             </w:r>
           </w:p>
         </w:tc>
         <w:tc>
-          <w:tcPr>
-            <w:tcW w:w="0" w:type="auto"/>
-          </w:tcPr>
+          <w:tcPr/>
           <w:p>
             <w:pPr>
               <w:pStyle w:val="Compact"/>
-              <w:spacing w:before="20" w:after="20"/>
+              <w:spacing w:after="20" w:before="20"/>
             </w:pPr>
             <w:r>
               <w:rPr>
                 <w:sz w:val="19"/>
               </w:rPr>
-              <w:t>No</w:t>
+              <w:t xml:space="preserve">No</w:t>
             </w:r>
           </w:p>
         </w:tc>
         <w:tc>
-          <w:tcPr>
-            <w:tcW w:w="0" w:type="auto"/>
-          </w:tcPr>
+          <w:tcPr/>
           <w:p>
             <w:pPr>
               <w:pStyle w:val="Compact"/>
-              <w:spacing w:before="20" w:after="20"/>
+              <w:spacing w:after="20" w:before="20"/>
             </w:pPr>
             <w:r>
               <w:rPr>
                 <w:sz w:val="19"/>
               </w:rPr>
-              <w:t xml:space="preserve">Yes — </w:t>
+              <w:t xml:space="preserve">Yes —</w:t>
+            </w:r>
+            <w:r>
+              <w:rPr>
+                <w:sz w:val="19"/>
+              </w:rPr>
+              <w:t xml:space="preserve"> </w:t>
             </w:r>
             <w:r>
               <w:rPr>
@@ -569,79 +589,79 @@
                 <w:bCs/>
                 <w:sz w:val="19"/>
               </w:rPr>
-              <w:t>Automations</w:t>
-            </w:r>
-            <w:r>
-              <w:rPr>
-                <w:sz w:val="19"/>
-              </w:rPr>
-              <w:t xml:space="preserve"> run on a schedule or on events</w:t>
+              <w:t xml:space="preserve">Automations</w:t>
+            </w:r>
+            <w:r>
+              <w:rPr>
+                <w:sz w:val="19"/>
+              </w:rPr>
+              <w:t xml:space="preserve"> </w:t>
+            </w:r>
+            <w:r>
+              <w:rPr>
+                <w:sz w:val="19"/>
+              </w:rPr>
+              <w:t xml:space="preserve">run on a schedule or on events</w:t>
             </w:r>
           </w:p>
         </w:tc>
       </w:tr>
       <w:tr>
         <w:tc>
-          <w:tcPr>
-            <w:tcW w:w="0" w:type="auto"/>
-          </w:tcPr>
+          <w:tcPr/>
           <w:p>
             <w:pPr>
               <w:pStyle w:val="Compact"/>
-              <w:spacing w:before="20" w:after="20"/>
+              <w:spacing w:after="20" w:before="20"/>
             </w:pPr>
             <w:r>
               <w:rPr>
                 <w:sz w:val="19"/>
               </w:rPr>
-              <w:t>Example (HR)</w:t>
+              <w:t xml:space="preserve">Example (HR)</w:t>
             </w:r>
           </w:p>
         </w:tc>
         <w:tc>
-          <w:tcPr>
-            <w:tcW w:w="0" w:type="auto"/>
-          </w:tcPr>
+          <w:tcPr/>
           <w:p>
             <w:pPr>
               <w:pStyle w:val="Compact"/>
-              <w:spacing w:before="20" w:after="20"/>
+              <w:spacing w:after="20" w:before="20"/>
             </w:pPr>
             <w:r>
               <w:rPr>
                 <w:sz w:val="19"/>
               </w:rPr>
-              <w:t>"Summarize this policy in 3 bullets"</w:t>
+              <w:t xml:space="preserve">"Summarize this policy in 3 bullets"</w:t>
             </w:r>
           </w:p>
         </w:tc>
         <w:tc>
-          <w:tcPr>
-            <w:tcW w:w="0" w:type="auto"/>
-          </w:tcPr>
+          <w:tcPr/>
           <w:p>
             <w:pPr>
               <w:pStyle w:val="Compact"/>
-              <w:spacing w:before="20" w:after="20"/>
+              <w:spacing w:after="20" w:before="20"/>
             </w:pPr>
             <w:r>
               <w:rPr>
                 <w:sz w:val="19"/>
               </w:rPr>
-              <w:t>"Draft welcome emails for all 4 new hires, ground them in our onboarding checklist, and save them as drafts"</w:t>
+              <w:t xml:space="preserve">"Draft welcome emails for all 4 new hires, ground them in our onboarding checklist, and save them as drafts"</w:t>
             </w:r>
           </w:p>
         </w:tc>
       </w:tr>
     </w:tbl>
+    <w:bookmarkEnd w:id="10"/>
+    <w:bookmarkStart w:id="11" w:name="when-to-use-which-hr-examples"/>
     <w:p>
       <w:pPr>
         <w:pStyle w:val="Heading2"/>
       </w:pPr>
-      <w:bookmarkStart w:id="3" w:name="when-to-use-which-hr-examples"/>
-      <w:bookmarkEnd w:id="2"/>
-      <w:r>
-        <w:t>When to use which (HR examples)</w:t>
+      <w:r>
+        <w:t xml:space="preserve">When to use which (HR examples)</w:t>
       </w:r>
     </w:p>
     <w:p>
@@ -653,7 +673,7 @@
           <w:b/>
           <w:bCs/>
         </w:rPr>
-        <w:t>Reach for Copilot (Chat) when…</w:t>
+        <w:t xml:space="preserve">Reach for Copilot (Chat) when…</w:t>
       </w:r>
     </w:p>
     <w:p>
@@ -661,18 +681,21 @@
         <w:pStyle w:val="Compact"/>
         <w:numPr>
           <w:ilvl w:val="0"/>
-          <w:numId w:val="3"/>
+          <w:numId w:val="1002"/>
         </w:numPr>
       </w:pPr>
       <w:r>
-        <w:t xml:space="preserve">You want a fast answer: </w:t>
+        <w:t xml:space="preserve">You want a fast answer:</w:t>
+      </w:r>
+      <w:r>
+        <w:t xml:space="preserve"> </w:t>
       </w:r>
       <w:r>
         <w:rPr>
           <w:i/>
           <w:iCs/>
         </w:rPr>
-        <w:t>"What's our PTO carryover rule?"</w:t>
+        <w:t xml:space="preserve">"What's our PTO carryover rule?"</w:t>
       </w:r>
     </w:p>
     <w:p>
@@ -680,18 +703,21 @@
         <w:pStyle w:val="Compact"/>
         <w:numPr>
           <w:ilvl w:val="0"/>
-          <w:numId w:val="3"/>
+          <w:numId w:val="1002"/>
         </w:numPr>
       </w:pPr>
       <w:r>
-        <w:t xml:space="preserve">You're polishing text you already have: </w:t>
+        <w:t xml:space="preserve">You're polishing text you already have:</w:t>
+      </w:r>
+      <w:r>
+        <w:t xml:space="preserve"> </w:t>
       </w:r>
       <w:r>
         <w:rPr>
           <w:i/>
           <w:iCs/>
         </w:rPr>
-        <w:t>"Make this message warmer."</w:t>
+        <w:t xml:space="preserve">"Make this message warmer."</w:t>
       </w:r>
     </w:p>
     <w:p>
@@ -699,11 +725,11 @@
         <w:pStyle w:val="Compact"/>
         <w:numPr>
           <w:ilvl w:val="0"/>
-          <w:numId w:val="3"/>
+          <w:numId w:val="1002"/>
         </w:numPr>
       </w:pPr>
       <w:r>
-        <w:t>You need a quick summary of one document or thread.</w:t>
+        <w:t xml:space="preserve">You need a quick summary of one document or thread.</w:t>
       </w:r>
     </w:p>
     <w:p>
@@ -715,7 +741,7 @@
           <w:b/>
           <w:bCs/>
         </w:rPr>
-        <w:t>Reach for Cowork when…</w:t>
+        <w:t xml:space="preserve">Reach for Cowork when…</w:t>
       </w:r>
     </w:p>
     <w:p>
@@ -723,38 +749,64 @@
         <w:pStyle w:val="Compact"/>
         <w:numPr>
           <w:ilvl w:val="0"/>
-          <w:numId w:val="4"/>
+          <w:numId w:val="1003"/>
         </w:numPr>
       </w:pPr>
       <w:r>
-        <w:t xml:space="preserve">The task has </w:t>
+        <w:t xml:space="preserve">The task has</w:t>
+      </w:r>
+      <w:r>
+        <w:t xml:space="preserve"> </w:t>
       </w:r>
       <w:r>
         <w:rPr>
           <w:b/>
           <w:bCs/>
         </w:rPr>
-        <w:t>several steps</w:t>
-      </w:r>
-      <w:r>
-        <w:t xml:space="preserve"> and ends in a </w:t>
+        <w:t xml:space="preserve">several steps</w:t>
+      </w:r>
+      <w:r>
+        <w:t xml:space="preserve"> </w:t>
+      </w:r>
+      <w:r>
+        <w:t xml:space="preserve">and ends in a</w:t>
+      </w:r>
+      <w:r>
+        <w:t xml:space="preserve"> </w:t>
       </w:r>
       <w:r>
         <w:rPr>
           <w:b/>
           <w:bCs/>
         </w:rPr>
-        <w:t>deliverable</w:t>
-      </w:r>
-      <w:r>
-        <w:t xml:space="preserve">: </w:t>
+        <w:t xml:space="preserve">deliverable</w:t>
+      </w:r>
+      <w:r>
+        <w:t xml:space="preserve">:</w:t>
+      </w:r>
+      <w:r>
+        <w:t xml:space="preserve"> </w:t>
       </w:r>
       <w:r>
         <w:rPr>
           <w:i/>
           <w:iCs/>
         </w:rPr>
-        <w:t>"Build an onboarding orientation deck from our checklist and benefits summary."</w:t>
+        <w:t xml:space="preserve">"Build an onboarding orientation</w:t>
+      </w:r>
+      <w:r>
+        <w:rPr>
+          <w:i/>
+          <w:iCs/>
+        </w:rPr>
+        <w:t xml:space="preserve"> </w:t>
+      </w:r>
+      <w:r>
+        <w:rPr>
+          <w:i/>
+          <w:iCs/>
+        </w:rPr>
+        <w:t xml:space="preserve">deck from our checklist and benefits summary."</w:t>
       </w:r>
     </w:p>
     <w:p>
@@ -762,21 +814,27 @@
         <w:pStyle w:val="Compact"/>
         <w:numPr>
           <w:ilvl w:val="0"/>
-          <w:numId w:val="4"/>
+          <w:numId w:val="1003"/>
         </w:numPr>
       </w:pPr>
       <w:r>
-        <w:t xml:space="preserve">You want it to </w:t>
+        <w:t xml:space="preserve">You want it to</w:t>
+      </w:r>
+      <w:r>
+        <w:t xml:space="preserve"> </w:t>
       </w:r>
       <w:r>
         <w:rPr>
           <w:b/>
           <w:bCs/>
         </w:rPr>
-        <w:t>act</w:t>
-      </w:r>
-      <w:r>
-        <w:t xml:space="preserve"> across apps: draft + schedule + notify.</w:t>
+        <w:t xml:space="preserve">act</w:t>
+      </w:r>
+      <w:r>
+        <w:t xml:space="preserve"> </w:t>
+      </w:r>
+      <w:r>
+        <w:t xml:space="preserve">across apps: draft + schedule + notify.</w:t>
       </w:r>
     </w:p>
     <w:p>
@@ -784,28 +842,34 @@
         <w:pStyle w:val="Compact"/>
         <w:numPr>
           <w:ilvl w:val="0"/>
-          <w:numId w:val="4"/>
+          <w:numId w:val="1003"/>
         </w:numPr>
       </w:pPr>
       <w:r>
-        <w:t xml:space="preserve">You want it to </w:t>
+        <w:t xml:space="preserve">You want it to</w:t>
+      </w:r>
+      <w:r>
+        <w:t xml:space="preserve"> </w:t>
       </w:r>
       <w:r>
         <w:rPr>
           <w:b/>
           <w:bCs/>
         </w:rPr>
-        <w:t>repeat on a schedule</w:t>
-      </w:r>
-      <w:r>
-        <w:t xml:space="preserve">: </w:t>
+        <w:t xml:space="preserve">repeat on a schedule</w:t>
+      </w:r>
+      <w:r>
+        <w:t xml:space="preserve">:</w:t>
+      </w:r>
+      <w:r>
+        <w:t xml:space="preserve"> </w:t>
       </w:r>
       <w:r>
         <w:rPr>
           <w:i/>
           <w:iCs/>
         </w:rPr>
-        <w:t>"Every Monday, summarize open HR tickets."</w:t>
+        <w:t xml:space="preserve">"Every Monday, summarize open HR tickets."</w:t>
       </w:r>
     </w:p>
     <w:p>
@@ -823,89 +887,150 @@
           <w:b/>
           <w:bCs/>
         </w:rPr>
-        <w:t>Rule of thumb:</w:t>
-      </w:r>
-      <w:r>
-        <w:t xml:space="preserve"> If you'd normally open several apps and it ends in a file, email, schedule, or report — that's a </w:t>
+        <w:t xml:space="preserve">Rule of thumb:</w:t>
+      </w:r>
+      <w:r>
+        <w:t xml:space="preserve"> </w:t>
+      </w:r>
+      <w:r>
+        <w:t xml:space="preserve">If you'd normally open several apps and it ends in a file, email, schedule, or</w:t>
+      </w:r>
+      <w:r>
+        <w:t xml:space="preserve"> </w:t>
+      </w:r>
+      <w:r>
+        <w:t xml:space="preserve">report — that's a</w:t>
+      </w:r>
+      <w:r>
+        <w:t xml:space="preserve"> </w:t>
       </w:r>
       <w:r>
         <w:rPr>
           <w:b/>
           <w:bCs/>
         </w:rPr>
-        <w:t>Cowork</w:t>
-      </w:r>
-      <w:r>
-        <w:t xml:space="preserve"> job. If you just need an answer or a quick rewrite — that's </w:t>
+        <w:t xml:space="preserve">Cowork</w:t>
+      </w:r>
+      <w:r>
+        <w:t xml:space="preserve"> </w:t>
+      </w:r>
+      <w:r>
+        <w:t xml:space="preserve">job. If you just need an answer or a quick rewrite — that's</w:t>
+      </w:r>
+      <w:r>
+        <w:t xml:space="preserve"> </w:t>
       </w:r>
       <w:r>
         <w:rPr>
           <w:b/>
           <w:bCs/>
         </w:rPr>
-        <w:t>Copilot Chat</w:t>
-      </w:r>
-      <w:r>
-        <w:t>.</w:t>
+        <w:t xml:space="preserve">Copilot</w:t>
+      </w:r>
+      <w:r>
+        <w:rPr>
+          <w:b/>
+          <w:bCs/>
+        </w:rPr>
+        <w:t xml:space="preserve"> </w:t>
+      </w:r>
+      <w:r>
+        <w:rPr>
+          <w:b/>
+          <w:bCs/>
+        </w:rPr>
+        <w:t xml:space="preserve">Chat</w:t>
+      </w:r>
+      <w:r>
+        <w:t xml:space="preserve">.</w:t>
+      </w:r>
+    </w:p>
+    <w:bookmarkEnd w:id="11"/>
+    <w:bookmarkStart w:id="12" w:name="how-they-relate"/>
+    <w:p>
+      <w:pPr>
+        <w:pStyle w:val="Heading2"/>
+      </w:pPr>
+      <w:r>
+        <w:t xml:space="preserve">How they relate</w:t>
       </w:r>
     </w:p>
     <w:p>
       <w:pPr>
-        <w:pStyle w:val="Heading2"/>
-      </w:pPr>
-      <w:bookmarkStart w:id="4" w:name="how-they-relate"/>
-      <w:bookmarkEnd w:id="3"/>
-      <w:r>
-        <w:lastRenderedPageBreak/>
-        <w:t>How they relate</w:t>
-      </w:r>
-    </w:p>
-    <w:p>
-      <w:pPr>
         <w:pStyle w:val="FirstParagraph"/>
       </w:pPr>
       <w:r>
-        <w:t xml:space="preserve">Cowork isn't a </w:t>
+        <w:t xml:space="preserve">Cowork isn't a</w:t>
+      </w:r>
+      <w:r>
+        <w:t xml:space="preserve"> </w:t>
       </w:r>
       <w:r>
         <w:rPr>
           <w:i/>
           <w:iCs/>
         </w:rPr>
-        <w:t>replacement</w:t>
-      </w:r>
-      <w:r>
-        <w:t xml:space="preserve"> for Copilot Chat — it's the </w:t>
+        <w:t xml:space="preserve">replacement</w:t>
+      </w:r>
+      <w:r>
+        <w:t xml:space="preserve"> </w:t>
+      </w:r>
+      <w:r>
+        <w:t xml:space="preserve">for Copilot Chat — it's the</w:t>
+      </w:r>
+      <w:r>
+        <w:t xml:space="preserve"> </w:t>
       </w:r>
       <w:r>
         <w:rPr>
           <w:b/>
           <w:bCs/>
         </w:rPr>
-        <w:t>"get it done for me"</w:t>
-      </w:r>
-      <w:r>
-        <w:t xml:space="preserve"> mode of the same Microsoft 365 Copilot family. Both are grounded in your work through </w:t>
+        <w:t xml:space="preserve">"get it done for me"</w:t>
+      </w:r>
+      <w:r>
+        <w:t xml:space="preserve"> </w:t>
+      </w:r>
+      <w:r>
+        <w:t xml:space="preserve">mode of the same</w:t>
+      </w:r>
+      <w:r>
+        <w:t xml:space="preserve"> </w:t>
+      </w:r>
+      <w:r>
+        <w:t xml:space="preserve">Microsoft 365 Copilot family. Both are grounded in your work through</w:t>
+      </w:r>
+      <w:r>
+        <w:t xml:space="preserve"> </w:t>
       </w:r>
       <w:r>
         <w:rPr>
           <w:b/>
           <w:bCs/>
         </w:rPr>
-        <w:t>Work IQ</w:t>
-      </w:r>
-      <w:r>
-        <w:t xml:space="preserve"> and respect the same permissions. You'll switch between them: Chat for quick help, Cowork for finished work.</w:t>
+        <w:t xml:space="preserve">Work IQ</w:t>
+      </w:r>
+      <w:r>
+        <w:t xml:space="preserve"> </w:t>
+      </w:r>
+      <w:r>
+        <w:t xml:space="preserve">and respect the same</w:t>
+      </w:r>
+      <w:r>
+        <w:t xml:space="preserve"> </w:t>
+      </w:r>
+      <w:r>
+        <w:t xml:space="preserve">permissions. You'll switch between them: Chat for quick help, Cowork for finished work.</w:t>
       </w:r>
     </w:p>
+    <w:bookmarkEnd w:id="12"/>
+    <w:bookmarkStart w:id="14" w:name="what-this-means-for-today"/>
     <w:p>
       <w:pPr>
         <w:pStyle w:val="Heading2"/>
       </w:pPr>
-      <w:bookmarkStart w:id="5" w:name="what-this-means-for-today"/>
-      <w:bookmarkEnd w:id="4"/>
-      <w:r>
-        <w:t>What this means for today</w:t>
+      <w:r>
+        <w:t xml:space="preserve">What this means for today</w:t>
       </w:r>
     </w:p>
     <w:p>
@@ -913,21 +1038,33 @@
         <w:pStyle w:val="Compact"/>
         <w:numPr>
           <w:ilvl w:val="0"/>
-          <w:numId w:val="5"/>
+          <w:numId w:val="1004"/>
         </w:numPr>
       </w:pPr>
       <w:r>
-        <w:t xml:space="preserve">We spend the workshop in </w:t>
+        <w:t xml:space="preserve">We spend the workshop in</w:t>
+      </w:r>
+      <w:r>
+        <w:t xml:space="preserve"> </w:t>
       </w:r>
       <w:r>
         <w:rPr>
           <w:b/>
           <w:bCs/>
         </w:rPr>
-        <w:t>Cowork</w:t>
-      </w:r>
-      <w:r>
-        <w:t xml:space="preserve"> because HR work is full of multi-step, deliverable-producing tasks.</w:t>
+        <w:t xml:space="preserve">Cowork</w:t>
+      </w:r>
+      <w:r>
+        <w:t xml:space="preserve"> </w:t>
+      </w:r>
+      <w:r>
+        <w:t xml:space="preserve">because HR work is full of multi-step, deliverable-producing</w:t>
+      </w:r>
+      <w:r>
+        <w:t xml:space="preserve"> </w:t>
+      </w:r>
+      <w:r>
+        <w:t xml:space="preserve">tasks.</w:t>
       </w:r>
     </w:p>
     <w:p>
@@ -935,112 +1072,134 @@
         <w:pStyle w:val="Compact"/>
         <w:numPr>
           <w:ilvl w:val="0"/>
-          <w:numId w:val="5"/>
+          <w:numId w:val="1004"/>
         </w:numPr>
       </w:pPr>
       <w:r>
-        <w:t xml:space="preserve">At the very end we step </w:t>
+        <w:t xml:space="preserve">At the very end we step</w:t>
+      </w:r>
+      <w:r>
+        <w:t xml:space="preserve"> </w:t>
       </w:r>
       <w:r>
         <w:rPr>
           <w:b/>
           <w:bCs/>
         </w:rPr>
-        <w:t>outside Cowork</w:t>
-      </w:r>
-      <w:r>
-        <w:t xml:space="preserve"> to build a </w:t>
+        <w:t xml:space="preserve">outside Cowork</w:t>
+      </w:r>
+      <w:r>
+        <w:t xml:space="preserve"> </w:t>
+      </w:r>
+      <w:r>
+        <w:t xml:space="preserve">to build a</w:t>
+      </w:r>
+      <w:r>
+        <w:t xml:space="preserve"> </w:t>
       </w:r>
       <w:r>
         <w:rPr>
           <w:b/>
           <w:bCs/>
         </w:rPr>
-        <w:t>persistent agent</w:t>
-      </w:r>
-      <w:r>
-        <w:t xml:space="preserve"> with </w:t>
+        <w:t xml:space="preserve">persistent agent</w:t>
+      </w:r>
+      <w:r>
+        <w:t xml:space="preserve"> </w:t>
+      </w:r>
+      <w:r>
+        <w:t xml:space="preserve">with</w:t>
+      </w:r>
+      <w:r>
+        <w:t xml:space="preserve"> </w:t>
       </w:r>
       <w:r>
         <w:rPr>
           <w:b/>
           <w:bCs/>
         </w:rPr>
-        <w:t>Copilot Agent Builder</w:t>
-      </w:r>
-      <w:r>
-        <w:t xml:space="preserve"> (Exercise 8) — a different tool for when you want a </w:t>
+        <w:t xml:space="preserve">Copilot Agent</w:t>
       </w:r>
       <w:r>
         <w:rPr>
           <w:b/>
           <w:bCs/>
         </w:rPr>
-        <w:t>reusable, shareable Q&amp;A agent</w:t>
-      </w:r>
-      <w:r>
-        <w:t xml:space="preserve"> rather than a one-off task. See </w:t>
-      </w:r>
-      <w:hyperlink r:id="rId7">
+        <w:t xml:space="preserve"> </w:t>
+      </w:r>
+      <w:r>
+        <w:rPr>
+          <w:b/>
+          <w:bCs/>
+        </w:rPr>
+        <w:t xml:space="preserve">Builder</w:t>
+      </w:r>
+      <w:r>
+        <w:t xml:space="preserve"> </w:t>
+      </w:r>
+      <w:r>
+        <w:t xml:space="preserve">(Exercise 7) — a different tool for when you want a</w:t>
+      </w:r>
+      <w:r>
+        <w:t xml:space="preserve"> </w:t>
+      </w:r>
+      <w:r>
+        <w:rPr>
+          <w:b/>
+          <w:bCs/>
+        </w:rPr>
+        <w:t xml:space="preserve">reusable, shareable Q&amp;A agent</w:t>
+      </w:r>
+      <w:r>
+        <w:t xml:space="preserve"> </w:t>
+      </w:r>
+      <w:r>
+        <w:t xml:space="preserve">rather than a one-off task. See</w:t>
+      </w:r>
+      <w:r>
+        <w:t xml:space="preserve"> </w:t>
+      </w:r>
+      <w:hyperlink r:id="rId13">
         <w:r>
           <w:rPr>
             <w:rStyle w:val="Hyperlink"/>
           </w:rPr>
-          <w:t>08-agent-builder-policy-agent.docx</w:t>
+          <w:t xml:space="preserve">08-agent-builder-policy-agent.docx</w:t>
         </w:r>
       </w:hyperlink>
       <w:r>
-        <w:t>.</w:t>
-      </w:r>
-      <w:bookmarkEnd w:id="0"/>
-      <w:bookmarkEnd w:id="5"/>
+        <w:t xml:space="preserve">.</w:t>
+      </w:r>
     </w:p>
+    <w:bookmarkEnd w:id="14"/>
+    <w:bookmarkEnd w:id="15"/>
     <w:sectPr>
-      <w:footerReference w:type="default" r:id="rId8"/>
+      <w:footerReference w:type="default" r:id="rId9"/>
       <w:footnotePr>
         <w:numRestart w:val="eachSect"/>
       </w:footnotePr>
-      <w:pgSz w:w="12240" w:h="15840"/>
-      <w:pgMar w:top="1152" w:right="1224" w:bottom="1152" w:left="1224" w:header="720" w:footer="720" w:gutter="0"/>
-      <w:cols w:space="720"/>
+      <w:pgSz w:h="15840" w:w="12240"/>
+      <w:pgMar w:bottom="1152" w:left="1224" w:right="1224" w:top="1152"/>
     </w:sectPr>
   </w:body>
 </w:document>
 </file>
 
-<file path=word/endnotes.xml><?xml version="1.0" encoding="utf-8"?>
-<w:endnotes xmlns:wpc="http://schemas.microsoft.com/office/word/2010/wordprocessingCanvas" xmlns:cx="http://schemas.microsoft.com/office/drawing/2014/chartex" xmlns:cx1="http://schemas.microsoft.com/office/drawing/2015/9/8/chartex" xmlns:cx2="http://schemas.microsoft.com/office/drawing/2015/10/21/chartex" xmlns:cx3="http://schemas.microsoft.com/office/drawing/2016/5/9/chartex" xmlns:cx4="http://schemas.microsoft.com/office/drawing/2016/5/10/chartex" xmlns:cx5="http://schemas.microsoft.com/office/drawing/2016/5/11/chartex" xmlns:cx6="http://schemas.microsoft.com/office/drawing/2016/5/12/chartex" xmlns:cx7="http://schemas.microsoft.com/office/drawing/2016/5/13/chartex" xmlns:cx8="http://schemas.microsoft.com/office/drawing/2016/5/14/chartex" xmlns:mc="http://schemas.openxmlformats.org/markup-compatibility/2006" xmlns:aink="http://schemas.microsoft.com/office/drawing/2016/ink" xmlns:am3d="http://schemas.microsoft.com/office/drawing/2017/model3d" xmlns:o="urn:schemas-microsoft-com:office:office" xmlns:oel="http://schemas.microsoft.com/office/2019/extlst" xmlns:r="http://schemas.openxmlformats.org/officeDocument/2006/relationships" xmlns:m="http://schemas.openxmlformats.org/officeDocument/2006/math" xmlns:v="urn:schemas-microsoft-com:vml" xmlns:wp14="http://schemas.microsoft.com/office/word/2010/wordprocessingDrawing" xmlns:wp="http://schemas.openxmlformats.org/drawingml/2006/wordprocessingDrawing" xmlns:w10="urn:schemas-microsoft-com:office:word" xmlns:w="http://schemas.openxmlformats.org/wordprocessingml/2006/main" xmlns:w14="http://schemas.microsoft.com/office/word/2010/wordml" xmlns:w15="http://schemas.microsoft.com/office/word/2012/wordml" xmlns:w16cex="http://schemas.microsoft.com/office/word/2018/wordml/cex" xmlns:w16cid="http://schemas.microsoft.com/office/word/2016/wordml/cid" xmlns:w16="http://schemas.microsoft.com/office/word/2018/wordml" xmlns:w16du="http://schemas.microsoft.com/office/word/2023/wordml/word16du" xmlns:w16sdtdh="http://schemas.microsoft.com/office/word/2020/wordml/sdtdatahash" xmlns:w16sdtfl="http://schemas.microsoft.com/office/word/2024/wordml/sdtformatlock" xmlns:w16se="http://schemas.microsoft.com/office/word/2015/wordml/symex" xmlns:wpg="http://schemas.microsoft.com/office/word/2010/wordprocessingGroup" xmlns:wpi="http://schemas.microsoft.com/office/word/2010/wordprocessingInk" xmlns:wne="http://schemas.microsoft.com/office/word/2006/wordml" xmlns:wps="http://schemas.microsoft.com/office/word/2010/wordprocessingShape" mc:Ignorable="w14 w15 w16se w16cid w16 w16cex w16sdtdh w16sdtfl w16du wp14">
-  <w:endnote w:type="separator" w:id="-1">
-    <w:p>
-      <w:pPr>
-        <w:spacing w:after="0"/>
-      </w:pPr>
-      <w:r>
-        <w:separator/>
-      </w:r>
-    </w:p>
-  </w:endnote>
-  <w:endnote w:type="continuationSeparator" w:id="0">
-    <w:p>
-      <w:pPr>
-        <w:spacing w:after="0"/>
-      </w:pPr>
-      <w:r>
-        <w:continuationSeparator/>
-      </w:r>
-    </w:p>
-  </w:endnote>
-</w:endnotes>
+<file path=word/comments.xml><?xml version="1.0" encoding="utf-8"?>
+<w:comments xmlns:w="http://schemas.openxmlformats.org/wordprocessingml/2006/main" xmlns:m="http://schemas.openxmlformats.org/officeDocument/2006/math" xmlns:r="http://schemas.openxmlformats.org/officeDocument/2006/relationships" xmlns:o="urn:schemas-microsoft-com:office:office" xmlns:v="urn:schemas-microsoft-com:vml" xmlns:w10="urn:schemas-microsoft-com:office:word" xmlns:a="http://schemas.openxmlformats.org/drawingml/2006/main" xmlns:pic="http://schemas.openxmlformats.org/drawingml/2006/picture" xmlns:wp="http://schemas.openxmlformats.org/drawingml/2006/wordprocessingDrawing"/>
 </file>
 
 <file path=word/footer1.xml><?xml version="1.0" encoding="utf-8"?>
-<w:ftr xmlns:wpc="http://schemas.microsoft.com/office/word/2010/wordprocessingCanvas" xmlns:cx="http://schemas.microsoft.com/office/drawing/2014/chartex" xmlns:cx1="http://schemas.microsoft.com/office/drawing/2015/9/8/chartex" xmlns:cx2="http://schemas.microsoft.com/office/drawing/2015/10/21/chartex" xmlns:cx3="http://schemas.microsoft.com/office/drawing/2016/5/9/chartex" xmlns:cx4="http://schemas.microsoft.com/office/drawing/2016/5/10/chartex" xmlns:cx5="http://schemas.microsoft.com/office/drawing/2016/5/11/chartex" xmlns:cx6="http://schemas.microsoft.com/office/drawing/2016/5/12/chartex" xmlns:cx7="http://schemas.microsoft.com/office/drawing/2016/5/13/chartex" xmlns:cx8="http://schemas.microsoft.com/office/drawing/2016/5/14/chartex" xmlns:mc="http://schemas.openxmlformats.org/markup-compatibility/2006" xmlns:aink="http://schemas.microsoft.com/office/drawing/2016/ink" xmlns:am3d="http://schemas.microsoft.com/office/drawing/2017/model3d" xmlns:o="urn:schemas-microsoft-com:office:office" xmlns:oel="http://schemas.microsoft.com/office/2019/extlst" xmlns:r="http://schemas.openxmlformats.org/officeDocument/2006/relationships" xmlns:m="http://schemas.openxmlformats.org/officeDocument/2006/math" xmlns:v="urn:schemas-microsoft-com:vml" xmlns:wp14="http://schemas.microsoft.com/office/word/2010/wordprocessingDrawing" xmlns:wp="http://schemas.openxmlformats.org/drawingml/2006/wordprocessingDrawing" xmlns:w10="urn:schemas-microsoft-com:office:word" xmlns:w="http://schemas.openxmlformats.org/wordprocessingml/2006/main" xmlns:w14="http://schemas.microsoft.com/office/word/2010/wordml" xmlns:w15="http://schemas.microsoft.com/office/word/2012/wordml" xmlns:w16cex="http://schemas.microsoft.com/office/word/2018/wordml/cex" xmlns:w16cid="http://schemas.microsoft.com/office/word/2016/wordml/cid" xmlns:w16="http://schemas.microsoft.com/office/word/2018/wordml" xmlns:w16du="http://schemas.microsoft.com/office/word/2023/wordml/word16du" xmlns:w16sdtdh="http://schemas.microsoft.com/office/word/2020/wordml/sdtdatahash" xmlns:w16sdtfl="http://schemas.microsoft.com/office/word/2024/wordml/sdtformatlock" xmlns:w16se="http://schemas.microsoft.com/office/word/2015/wordml/symex" xmlns:wpg="http://schemas.microsoft.com/office/word/2010/wordprocessingGroup" xmlns:wpi="http://schemas.microsoft.com/office/word/2010/wordprocessingInk" xmlns:wne="http://schemas.microsoft.com/office/word/2006/wordml" xmlns:wps="http://schemas.microsoft.com/office/word/2010/wordprocessingShape" mc:Ignorable="w14 w15 w16se w16cid w16 w16cex w16sdtdh w16sdtfl w16du wp14">
+<w:ftr xmlns:m="http://schemas.openxmlformats.org/officeDocument/2006/math" xmlns:mc="http://schemas.openxmlformats.org/markup-compatibility/2006" xmlns:mo="http://schemas.microsoft.com/office/mac/office/2008/main" xmlns:mv="urn:schemas-microsoft-com:mac:vml" xmlns:o="urn:schemas-microsoft-com:office:office" xmlns:r="http://schemas.openxmlformats.org/officeDocument/2006/relationships" xmlns:v="urn:schemas-microsoft-com:vml" xmlns:w10="urn:schemas-microsoft-com:office:word" xmlns:w14="http://schemas.microsoft.com/office/word/2010/wordml" xmlns:w="http://schemas.openxmlformats.org/wordprocessingml/2006/main" xmlns:wne="http://schemas.microsoft.com/office/word/2006/wordml" xmlns:wp14="http://schemas.microsoft.com/office/word/2010/wordprocessingDrawing" xmlns:wp="http://schemas.openxmlformats.org/drawingml/2006/wordprocessingDrawing" xmlns:wpc="http://schemas.microsoft.com/office/word/2010/wordprocessingCanvas" xmlns:wpg="http://schemas.microsoft.com/office/word/2010/wordprocessingGroup" xmlns:wpi="http://schemas.microsoft.com/office/word/2010/wordprocessingInk" xmlns:wps="http://schemas.microsoft.com/office/word/2010/wordprocessingShape" mc:Ignorable="w14 wp14">
   <w:p>
     <w:pPr>
+      <w:pStyle w:val="Footer"/>
       <w:jc w:val="right"/>
     </w:pPr>
+    <w:r/>
     <w:r>
       <w:rPr>
+        <w:rFonts w:ascii="Segoe UI" w:hAnsi="Segoe UI"/>
         <w:color w:val="616161"/>
         <w:sz w:val="16"/>
       </w:rPr>
@@ -1052,34 +1211,7 @@
         <w:sz w:val="16"/>
       </w:rPr>
       <w:fldChar w:fldCharType="begin"/>
-    </w:r>
-    <w:r>
-      <w:rPr>
-        <w:color w:val="616161"/>
-        <w:sz w:val="16"/>
-      </w:rPr>
-      <w:instrText>PAGE</w:instrText>
-    </w:r>
-    <w:r>
-      <w:rPr>
-        <w:color w:val="616161"/>
-        <w:sz w:val="16"/>
-      </w:rPr>
-      <w:fldChar w:fldCharType="separate"/>
-    </w:r>
-    <w:r>
-      <w:rPr>
-        <w:noProof/>
-        <w:color w:val="616161"/>
-        <w:sz w:val="16"/>
-      </w:rPr>
-      <w:t>1</w:t>
-    </w:r>
-    <w:r>
-      <w:rPr>
-        <w:color w:val="616161"/>
-        <w:sz w:val="16"/>
-      </w:rPr>
+      <w:instrText xml:space="preserve">PAGE</w:instrText>
       <w:fldChar w:fldCharType="end"/>
     </w:r>
   </w:p>
@@ -1087,24 +1219,18 @@
 </file>
 
 <file path=word/footnotes.xml><?xml version="1.0" encoding="utf-8"?>
-<w:footnotes xmlns:wpc="http://schemas.microsoft.com/office/word/2010/wordprocessingCanvas" xmlns:cx="http://schemas.microsoft.com/office/drawing/2014/chartex" xmlns:cx1="http://schemas.microsoft.com/office/drawing/2015/9/8/chartex" xmlns:cx2="http://schemas.microsoft.com/office/drawing/2015/10/21/chartex" xmlns:cx3="http://schemas.microsoft.com/office/drawing/2016/5/9/chartex" xmlns:cx4="http://schemas.microsoft.com/office/drawing/2016/5/10/chartex" xmlns:cx5="http://schemas.microsoft.com/office/drawing/2016/5/11/chartex" xmlns:cx6="http://schemas.microsoft.com/office/drawing/2016/5/12/chartex" xmlns:cx7="http://schemas.microsoft.com/office/drawing/2016/5/13/chartex" xmlns:cx8="http://schemas.microsoft.com/office/drawing/2016/5/14/chartex" xmlns:mc="http://schemas.openxmlformats.org/markup-compatibility/2006" xmlns:aink="http://schemas.microsoft.com/office/drawing/2016/ink" xmlns:am3d="http://schemas.microsoft.com/office/drawing/2017/model3d" xmlns:o="urn:schemas-microsoft-com:office:office" xmlns:oel="http://schemas.microsoft.com/office/2019/extlst" xmlns:r="http://schemas.openxmlformats.org/officeDocument/2006/relationships" xmlns:m="http://schemas.openxmlformats.org/officeDocument/2006/math" xmlns:v="urn:schemas-microsoft-com:vml" xmlns:wp14="http://schemas.microsoft.com/office/word/2010/wordprocessingDrawing" xmlns:wp="http://schemas.openxmlformats.org/drawingml/2006/wordprocessingDrawing" xmlns:w10="urn:schemas-microsoft-com:office:word" xmlns:w="http://schemas.openxmlformats.org/wordprocessingml/2006/main" xmlns:w14="http://schemas.microsoft.com/office/word/2010/wordml" xmlns:w15="http://schemas.microsoft.com/office/word/2012/wordml" xmlns:w16cex="http://schemas.microsoft.com/office/word/2018/wordml/cex" xmlns:w16cid="http://schemas.microsoft.com/office/word/2016/wordml/cid" xmlns:w16="http://schemas.microsoft.com/office/word/2018/wordml" xmlns:w16du="http://schemas.microsoft.com/office/word/2023/wordml/word16du" xmlns:w16sdtdh="http://schemas.microsoft.com/office/word/2020/wordml/sdtdatahash" xmlns:w16sdtfl="http://schemas.microsoft.com/office/word/2024/wordml/sdtformatlock" xmlns:w16se="http://schemas.microsoft.com/office/word/2015/wordml/symex" xmlns:wpg="http://schemas.microsoft.com/office/word/2010/wordprocessingGroup" xmlns:wpi="http://schemas.microsoft.com/office/word/2010/wordprocessingInk" xmlns:wne="http://schemas.microsoft.com/office/word/2006/wordml" xmlns:wps="http://schemas.microsoft.com/office/word/2010/wordprocessingShape" mc:Ignorable="w14 w15 w16se w16cid w16 w16cex w16sdtdh w16sdtfl w16du wp14">
+<w:footnotes xmlns:w="http://schemas.openxmlformats.org/wordprocessingml/2006/main" xmlns:m="http://schemas.openxmlformats.org/officeDocument/2006/math" xmlns:r="http://schemas.openxmlformats.org/officeDocument/2006/relationships" xmlns:o="urn:schemas-microsoft-com:office:office" xmlns:v="urn:schemas-microsoft-com:vml" xmlns:w10="urn:schemas-microsoft-com:office:word" xmlns:a="http://schemas.openxmlformats.org/drawingml/2006/main" xmlns:pic="http://schemas.openxmlformats.org/drawingml/2006/picture" xmlns:wp="http://schemas.openxmlformats.org/drawingml/2006/wordprocessingDrawing">
+  <w:footnote w:type="continuationSeparator" w:id="0">
+    <w:p>
+      <w:r>
+        <w:continuationSeparator/>
+      </w:r>
+    </w:p>
+  </w:footnote>
   <w:footnote w:type="separator" w:id="-1">
     <w:p>
-      <w:pPr>
-        <w:spacing w:after="0"/>
-      </w:pPr>
       <w:r>
         <w:separator/>
-      </w:r>
-    </w:p>
-  </w:footnote>
-  <w:footnote w:type="continuationSeparator" w:id="0">
-    <w:p>
-      <w:pPr>
-        <w:spacing w:after="0"/>
-      </w:pPr>
-      <w:r>
-        <w:continuationSeparator/>
       </w:r>
     </w:p>
   </w:footnote>
@@ -1112,11 +1238,10 @@
 </file>
 
 <file path=word/numbering.xml><?xml version="1.0" encoding="utf-8"?>
-<w:numbering xmlns:wpc="http://schemas.microsoft.com/office/word/2010/wordprocessingCanvas" xmlns:cx="http://schemas.microsoft.com/office/drawing/2014/chartex" xmlns:cx1="http://schemas.microsoft.com/office/drawing/2015/9/8/chartex" xmlns:cx2="http://schemas.microsoft.com/office/drawing/2015/10/21/chartex" xmlns:cx3="http://schemas.microsoft.com/office/drawing/2016/5/9/chartex" xmlns:cx4="http://schemas.microsoft.com/office/drawing/2016/5/10/chartex" xmlns:cx5="http://schemas.microsoft.com/office/drawing/2016/5/11/chartex" xmlns:cx6="http://schemas.microsoft.com/office/drawing/2016/5/12/chartex" xmlns:cx7="http://schemas.microsoft.com/office/drawing/2016/5/13/chartex" xmlns:cx8="http://schemas.microsoft.com/office/drawing/2016/5/14/chartex" xmlns:mc="http://schemas.openxmlformats.org/markup-compatibility/2006" xmlns:aink="http://schemas.microsoft.com/office/drawing/2016/ink" xmlns:am3d="http://schemas.microsoft.com/office/drawing/2017/model3d" xmlns:o="urn:schemas-microsoft-com:office:office" xmlns:oel="http://schemas.microsoft.com/office/2019/extlst" xmlns:r="http://schemas.openxmlformats.org/officeDocument/2006/relationships" xmlns:m="http://schemas.openxmlformats.org/officeDocument/2006/math" xmlns:v="urn:schemas-microsoft-com:vml" xmlns:wp14="http://schemas.microsoft.com/office/word/2010/wordprocessingDrawing" xmlns:wp="http://schemas.openxmlformats.org/drawingml/2006/wordprocessingDrawing" xmlns:w10="urn:schemas-microsoft-com:office:word" xmlns:w="http://schemas.openxmlformats.org/wordprocessingml/2006/main" xmlns:w14="http://schemas.microsoft.com/office/word/2010/wordml" xmlns:w15="http://schemas.microsoft.com/office/word/2012/wordml" xmlns:w16cex="http://schemas.microsoft.com/office/word/2018/wordml/cex" xmlns:w16cid="http://schemas.microsoft.com/office/word/2016/wordml/cid" xmlns:w16="http://schemas.microsoft.com/office/word/2018/wordml" xmlns:w16du="http://schemas.microsoft.com/office/word/2023/wordml/word16du" xmlns:w16sdtdh="http://schemas.microsoft.com/office/word/2020/wordml/sdtdatahash" xmlns:w16sdtfl="http://schemas.microsoft.com/office/word/2024/wordml/sdtformatlock" xmlns:w16se="http://schemas.microsoft.com/office/word/2015/wordml/symex" xmlns:wpg="http://schemas.microsoft.com/office/word/2010/wordprocessingGroup" xmlns:wpi="http://schemas.microsoft.com/office/word/2010/wordprocessingInk" xmlns:wne="http://schemas.microsoft.com/office/word/2006/wordml" xmlns:wps="http://schemas.microsoft.com/office/word/2010/wordprocessingShape" mc:Ignorable="w14 w15 w16se w16cid w16 w16cex w16sdtdh w16sdtfl w16du wp14">
-  <w:abstractNum w:abstractNumId="0" w15:restartNumberingAfterBreak="0">
+<w:numbering xmlns:w="http://schemas.openxmlformats.org/wordprocessingml/2006/main">
+  <w:abstractNum w:abstractNumId="990">
     <w:nsid w:val="0000A990"/>
     <w:multiLevelType w:val="multilevel"/>
-    <w:tmpl w:val="9F422766"/>
     <w:lvl w:ilvl="0">
       <w:numFmt w:val="bullet"/>
       <w:lvlText w:val=" "/>
@@ -1190,10 +1315,9 @@
       </w:pPr>
     </w:lvl>
   </w:abstractNum>
-  <w:abstractNum w:abstractNumId="1" w15:restartNumberingAfterBreak="0">
+  <w:abstractNum w:abstractNumId="991">
     <w:nsid w:val="0000A991"/>
     <w:multiLevelType w:val="multilevel"/>
-    <w:tmpl w:val="C0B2092A"/>
     <w:lvl w:ilvl="0">
       <w:numFmt w:val="bullet"/>
       <w:lvlText w:val=""/>
@@ -1294,33 +1418,33 @@
       </w:rPr>
     </w:lvl>
   </w:abstractNum>
-  <w:num w:numId="1" w16cid:durableId="1787507629">
-    <w:abstractNumId w:val="0"/>
+  <w:num w:numId="1000">
+    <w:abstractNumId w:val="990"/>
   </w:num>
-  <w:num w:numId="2" w16cid:durableId="748892298">
-    <w:abstractNumId w:val="1"/>
+  <w:num w:numId="1001">
+    <w:abstractNumId w:val="991"/>
   </w:num>
-  <w:num w:numId="3" w16cid:durableId="1075585991">
-    <w:abstractNumId w:val="1"/>
+  <w:num w:numId="1002">
+    <w:abstractNumId w:val="991"/>
   </w:num>
-  <w:num w:numId="4" w16cid:durableId="1931352377">
-    <w:abstractNumId w:val="1"/>
+  <w:num w:numId="1003">
+    <w:abstractNumId w:val="991"/>
   </w:num>
-  <w:num w:numId="5" w16cid:durableId="1617061436">
-    <w:abstractNumId w:val="1"/>
+  <w:num w:numId="1004">
+    <w:abstractNumId w:val="991"/>
   </w:num>
 </w:numbering>
 </file>
 
 <file path=word/styles.xml><?xml version="1.0" encoding="utf-8"?>
-<w:styles xmlns:mc="http://schemas.openxmlformats.org/markup-compatibility/2006" xmlns:r="http://schemas.openxmlformats.org/officeDocument/2006/relationships" xmlns:w="http://schemas.openxmlformats.org/wordprocessingml/2006/main" xmlns:w14="http://schemas.microsoft.com/office/word/2010/wordml" xmlns:w15="http://schemas.microsoft.com/office/word/2012/wordml" xmlns:w16cex="http://schemas.microsoft.com/office/word/2018/wordml/cex" xmlns:w16cid="http://schemas.microsoft.com/office/word/2016/wordml/cid" xmlns:w16="http://schemas.microsoft.com/office/word/2018/wordml" xmlns:w16du="http://schemas.microsoft.com/office/word/2023/wordml/word16du" xmlns:w16sdtdh="http://schemas.microsoft.com/office/word/2020/wordml/sdtdatahash" xmlns:w16sdtfl="http://schemas.microsoft.com/office/word/2024/wordml/sdtformatlock" xmlns:w16se="http://schemas.microsoft.com/office/word/2015/wordml/symex" mc:Ignorable="w14 w15 w16se w16cid w16 w16cex w16sdtdh w16sdtfl w16du">
+<w:styles xmlns:r="http://schemas.openxmlformats.org/officeDocument/2006/relationships" xmlns:w="http://schemas.openxmlformats.org/wordprocessingml/2006/main">
   <w:docDefaults>
     <w:rPrDefault>
       <w:rPr>
-        <w:rFonts w:asciiTheme="minorHAnsi" w:eastAsiaTheme="minorEastAsia" w:hAnsiTheme="minorHAnsi" w:cstheme="minorBidi"/>
+        <w:rFonts w:asciiTheme="minorHAnsi" w:cstheme="minorBidi" w:eastAsiaTheme="minorEastAsia" w:hAnsiTheme="minorHAnsi"/>
         <w:sz w:val="24"/>
         <w:szCs w:val="24"/>
-        <w:lang w:val="en-US" w:eastAsia="zh-CN" w:bidi="ar-SA"/>
+        <w:lang w:bidi="ar-SA" w:eastAsia="zh-CN" w:val="en-US"/>
       </w:rPr>
     </w:rPrDefault>
     <w:pPrDefault>
@@ -1329,260 +1453,189 @@
       </w:pPr>
     </w:pPrDefault>
   </w:docDefaults>
-  <w:latentStyles w:defLockedState="0" w:defUIPriority="0" w:defSemiHidden="0" w:defUnhideWhenUsed="0" w:defQFormat="0" w:count="376">
-    <w:lsdException w:name="Normal Table" w:semiHidden="1" w:unhideWhenUsed="1"/>
-    <w:lsdException w:name="Table Simple 1" w:semiHidden="1" w:unhideWhenUsed="1"/>
-    <w:lsdException w:name="Table Simple 2" w:semiHidden="1" w:unhideWhenUsed="1"/>
-    <w:lsdException w:name="Table Simple 3" w:semiHidden="1" w:unhideWhenUsed="1"/>
-    <w:lsdException w:name="Table Classic 1" w:semiHidden="1" w:unhideWhenUsed="1"/>
-    <w:lsdException w:name="Table Classic 2" w:semiHidden="1" w:unhideWhenUsed="1"/>
-    <w:lsdException w:name="Table Classic 3" w:semiHidden="1" w:unhideWhenUsed="1"/>
-    <w:lsdException w:name="Table Classic 4" w:semiHidden="1" w:unhideWhenUsed="1"/>
-    <w:lsdException w:name="Table Colorful 1" w:semiHidden="1" w:unhideWhenUsed="1"/>
-    <w:lsdException w:name="Table Colorful 2" w:semiHidden="1" w:unhideWhenUsed="1"/>
-    <w:lsdException w:name="Table Colorful 3" w:semiHidden="1" w:unhideWhenUsed="1"/>
-    <w:lsdException w:name="Table Columns 1" w:semiHidden="1" w:unhideWhenUsed="1"/>
-    <w:lsdException w:name="Table Columns 2" w:semiHidden="1" w:unhideWhenUsed="1"/>
-    <w:lsdException w:name="Table Columns 3" w:semiHidden="1" w:unhideWhenUsed="1"/>
-    <w:lsdException w:name="Table Columns 4" w:semiHidden="1" w:unhideWhenUsed="1"/>
-    <w:lsdException w:name="Table Columns 5" w:semiHidden="1" w:unhideWhenUsed="1"/>
-    <w:lsdException w:name="Table Grid 1" w:semiHidden="1" w:unhideWhenUsed="1"/>
-    <w:lsdException w:name="Table Grid 2" w:semiHidden="1" w:unhideWhenUsed="1"/>
-    <w:lsdException w:name="Table Grid 3" w:semiHidden="1" w:unhideWhenUsed="1"/>
-    <w:lsdException w:name="Table Grid 4" w:semiHidden="1" w:unhideWhenUsed="1"/>
-    <w:lsdException w:name="Table Grid 5" w:semiHidden="1" w:unhideWhenUsed="1"/>
-    <w:lsdException w:name="Table Grid 6" w:semiHidden="1" w:unhideWhenUsed="1"/>
-    <w:lsdException w:name="Table Grid 7" w:semiHidden="1" w:unhideWhenUsed="1"/>
-    <w:lsdException w:name="Table Grid 8" w:semiHidden="1" w:unhideWhenUsed="1"/>
-    <w:lsdException w:name="Table List 1" w:semiHidden="1" w:unhideWhenUsed="1"/>
-    <w:lsdException w:name="Table List 2" w:semiHidden="1" w:unhideWhenUsed="1"/>
-    <w:lsdException w:name="Table List 3" w:semiHidden="1" w:unhideWhenUsed="1"/>
-    <w:lsdException w:name="Table List 4" w:semiHidden="1" w:unhideWhenUsed="1"/>
-    <w:lsdException w:name="Table List 5" w:semiHidden="1" w:unhideWhenUsed="1"/>
-    <w:lsdException w:name="Table List 6" w:semiHidden="1" w:unhideWhenUsed="1"/>
-    <w:lsdException w:name="Table List 7" w:semiHidden="1" w:unhideWhenUsed="1"/>
-    <w:lsdException w:name="Table List 8" w:semiHidden="1" w:unhideWhenUsed="1"/>
-    <w:lsdException w:name="Table 3D effects 1" w:semiHidden="1" w:unhideWhenUsed="1"/>
-    <w:lsdException w:name="Table 3D effects 2" w:semiHidden="1" w:unhideWhenUsed="1"/>
-    <w:lsdException w:name="Table 3D effects 3" w:semiHidden="1" w:unhideWhenUsed="1"/>
-    <w:lsdException w:name="Table Contemporary" w:semiHidden="1" w:unhideWhenUsed="1"/>
-    <w:lsdException w:name="Table Elegant" w:semiHidden="1" w:unhideWhenUsed="1"/>
-    <w:lsdException w:name="Table Professional" w:semiHidden="1" w:unhideWhenUsed="1"/>
-    <w:lsdException w:name="Table Subtle 1" w:semiHidden="1" w:unhideWhenUsed="1"/>
-    <w:lsdException w:name="Table Subtle 2" w:semiHidden="1" w:unhideWhenUsed="1"/>
-    <w:lsdException w:name="Table Web 1" w:semiHidden="1" w:unhideWhenUsed="1"/>
-    <w:lsdException w:name="Table Web 2" w:semiHidden="1" w:unhideWhenUsed="1"/>
-    <w:lsdException w:name="Table Web 3" w:semiHidden="1" w:unhideWhenUsed="1"/>
-    <w:lsdException w:name="Table Theme" w:semiHidden="1" w:unhideWhenUsed="1"/>
-    <w:lsdException w:name="Light Shading"/>
-    <w:lsdException w:name="Light List"/>
-    <w:lsdException w:name="Light Grid"/>
-    <w:lsdException w:name="Medium Shading 1"/>
-    <w:lsdException w:name="Medium Shading 2"/>
-    <w:lsdException w:name="Medium List 1"/>
-    <w:lsdException w:name="Medium List 2"/>
-    <w:lsdException w:name="Medium Grid 1"/>
-    <w:lsdException w:name="Medium Grid 2"/>
-    <w:lsdException w:name="Medium Grid 3"/>
-    <w:lsdException w:name="Dark List"/>
-    <w:lsdException w:name="Colorful Shading"/>
-    <w:lsdException w:name="Colorful List"/>
-    <w:lsdException w:name="Colorful Grid"/>
-    <w:lsdException w:name="Light Shading Accent 1"/>
-    <w:lsdException w:name="Light List Accent 1"/>
-    <w:lsdException w:name="Light Grid Accent 1"/>
-    <w:lsdException w:name="Medium Shading 1 Accent 1"/>
-    <w:lsdException w:name="Medium Shading 2 Accent 1"/>
-    <w:lsdException w:name="Medium List 1 Accent 1"/>
-    <w:lsdException w:name="Medium List 2 Accent 1"/>
-    <w:lsdException w:name="Medium Grid 1 Accent 1"/>
-    <w:lsdException w:name="Medium Grid 2 Accent 1"/>
-    <w:lsdException w:name="Medium Grid 3 Accent 1"/>
-    <w:lsdException w:name="Dark List Accent 1"/>
-    <w:lsdException w:name="Colorful Shading Accent 1"/>
-    <w:lsdException w:name="Colorful List Accent 1"/>
-    <w:lsdException w:name="Colorful Grid Accent 1"/>
-    <w:lsdException w:name="Light Shading Accent 2"/>
-    <w:lsdException w:name="Light List Accent 2"/>
-    <w:lsdException w:name="Light Grid Accent 2"/>
-    <w:lsdException w:name="Medium Shading 1 Accent 2"/>
-    <w:lsdException w:name="Medium Shading 2 Accent 2"/>
-    <w:lsdException w:name="Medium List 1 Accent 2"/>
-    <w:lsdException w:name="Medium List 2 Accent 2"/>
-    <w:lsdException w:name="Medium Grid 1 Accent 2"/>
-    <w:lsdException w:name="Medium Grid 2 Accent 2"/>
-    <w:lsdException w:name="Medium Grid 3 Accent 2"/>
-    <w:lsdException w:name="Dark List Accent 2"/>
-    <w:lsdException w:name="Colorful Shading Accent 2"/>
-    <w:lsdException w:name="Colorful List Accent 2"/>
-    <w:lsdException w:name="Colorful Grid Accent 2"/>
-    <w:lsdException w:name="Light Shading Accent 3"/>
-    <w:lsdException w:name="Light List Accent 3"/>
-    <w:lsdException w:name="Light Grid Accent 3"/>
-    <w:lsdException w:name="Medium Shading 1 Accent 3"/>
-    <w:lsdException w:name="Medium Shading 2 Accent 3"/>
-    <w:lsdException w:name="Medium List 1 Accent 3"/>
-    <w:lsdException w:name="Medium List 2 Accent 3"/>
-    <w:lsdException w:name="Medium Grid 1 Accent 3"/>
-    <w:lsdException w:name="Medium Grid 2 Accent 3"/>
-    <w:lsdException w:name="Medium Grid 3 Accent 3"/>
-    <w:lsdException w:name="Dark List Accent 3"/>
-    <w:lsdException w:name="Colorful Shading Accent 3"/>
-    <w:lsdException w:name="Colorful List Accent 3"/>
-    <w:lsdException w:name="Colorful Grid Accent 3"/>
-    <w:lsdException w:name="Light Shading Accent 4"/>
-    <w:lsdException w:name="Light List Accent 4"/>
-    <w:lsdException w:name="Light Grid Accent 4"/>
-    <w:lsdException w:name="Medium Shading 1 Accent 4"/>
-    <w:lsdException w:name="Medium Shading 2 Accent 4"/>
-    <w:lsdException w:name="Medium List 1 Accent 4"/>
-    <w:lsdException w:name="Medium List 2 Accent 4"/>
-    <w:lsdException w:name="Medium Grid 1 Accent 4"/>
-    <w:lsdException w:name="Medium Grid 2 Accent 4"/>
-    <w:lsdException w:name="Medium Grid 3 Accent 4"/>
-    <w:lsdException w:name="Dark List Accent 4"/>
-    <w:lsdException w:name="Colorful Shading Accent 4"/>
-    <w:lsdException w:name="Colorful List Accent 4"/>
-    <w:lsdException w:name="Colorful Grid Accent 4"/>
-    <w:lsdException w:name="Light Shading Accent 5"/>
-    <w:lsdException w:name="Light List Accent 5"/>
-    <w:lsdException w:name="Light Grid Accent 5"/>
-    <w:lsdException w:name="Medium Shading 1 Accent 5"/>
-    <w:lsdException w:name="Medium Shading 2 Accent 5"/>
-    <w:lsdException w:name="Medium List 1 Accent 5"/>
-    <w:lsdException w:name="Medium List 2 Accent 5"/>
-    <w:lsdException w:name="Medium Grid 1 Accent 5"/>
-    <w:lsdException w:name="Medium Grid 2 Accent 5"/>
-    <w:lsdException w:name="Medium Grid 3 Accent 5"/>
-    <w:lsdException w:name="Dark List Accent 5"/>
-    <w:lsdException w:name="Colorful Shading Accent 5"/>
-    <w:lsdException w:name="Colorful List Accent 5"/>
-    <w:lsdException w:name="Colorful Grid Accent 5"/>
-    <w:lsdException w:name="Light Shading Accent 6"/>
-    <w:lsdException w:name="Light List Accent 6"/>
-    <w:lsdException w:name="Light Grid Accent 6"/>
-    <w:lsdException w:name="Medium Shading 1 Accent 6"/>
-    <w:lsdException w:name="Medium Shading 2 Accent 6"/>
-    <w:lsdException w:name="Medium List 1 Accent 6"/>
-    <w:lsdException w:name="Medium List 2 Accent 6"/>
-    <w:lsdException w:name="Medium Grid 1 Accent 6"/>
-    <w:lsdException w:name="Medium Grid 2 Accent 6"/>
-    <w:lsdException w:name="Medium Grid 3 Accent 6"/>
-    <w:lsdException w:name="Dark List Accent 6"/>
-    <w:lsdException w:name="Colorful Shading Accent 6"/>
-    <w:lsdException w:name="Colorful List Accent 6"/>
-    <w:lsdException w:name="Colorful Grid Accent 6"/>
-    <w:lsdException w:name="Grid Table 4" w:uiPriority="49"/>
-    <w:lsdException w:name="Grid Table 5 Dark" w:uiPriority="50"/>
-    <w:lsdException w:name="Grid Table 6 Colorful" w:uiPriority="51"/>
-    <w:lsdException w:name="Grid Table 7 Colorful" w:uiPriority="52"/>
-    <w:lsdException w:name="Grid Table 1 Light Accent 1" w:uiPriority="46"/>
-    <w:lsdException w:name="Grid Table 2 Accent 1" w:uiPriority="47"/>
-    <w:lsdException w:name="Grid Table 3 Accent 1" w:uiPriority="48"/>
-    <w:lsdException w:name="Grid Table 4 Accent 1" w:uiPriority="49"/>
-    <w:lsdException w:name="Grid Table 5 Dark Accent 1" w:uiPriority="50"/>
-    <w:lsdException w:name="Grid Table 6 Colorful Accent 1" w:uiPriority="51"/>
-    <w:lsdException w:name="Grid Table 7 Colorful Accent 1" w:uiPriority="52"/>
-    <w:lsdException w:name="Grid Table 1 Light Accent 2" w:uiPriority="46"/>
-    <w:lsdException w:name="Grid Table 2 Accent 2" w:uiPriority="47"/>
-    <w:lsdException w:name="Grid Table 3 Accent 2" w:uiPriority="48"/>
-    <w:lsdException w:name="Grid Table 4 Accent 2" w:uiPriority="49"/>
-    <w:lsdException w:name="Grid Table 5 Dark Accent 2" w:uiPriority="50"/>
-    <w:lsdException w:name="Grid Table 6 Colorful Accent 2" w:uiPriority="51"/>
-    <w:lsdException w:name="Grid Table 7 Colorful Accent 2" w:uiPriority="52"/>
-    <w:lsdException w:name="Grid Table 1 Light Accent 3" w:uiPriority="46"/>
-    <w:lsdException w:name="Grid Table 2 Accent 3" w:uiPriority="47"/>
-    <w:lsdException w:name="Grid Table 3 Accent 3" w:uiPriority="48"/>
-    <w:lsdException w:name="Grid Table 4 Accent 3" w:uiPriority="49"/>
-    <w:lsdException w:name="Grid Table 5 Dark Accent 3" w:uiPriority="50"/>
-    <w:lsdException w:name="Grid Table 6 Colorful Accent 3" w:uiPriority="51"/>
-    <w:lsdException w:name="Grid Table 7 Colorful Accent 3" w:uiPriority="52"/>
-    <w:lsdException w:name="Grid Table 1 Light Accent 4" w:uiPriority="46"/>
-    <w:lsdException w:name="Grid Table 2 Accent 4" w:uiPriority="47"/>
-    <w:lsdException w:name="Grid Table 3 Accent 4" w:uiPriority="48"/>
-    <w:lsdException w:name="Grid Table 4 Accent 4" w:uiPriority="49"/>
-    <w:lsdException w:name="Grid Table 5 Dark Accent 4" w:uiPriority="50"/>
-    <w:lsdException w:name="Grid Table 6 Colorful Accent 4" w:uiPriority="51"/>
-    <w:lsdException w:name="Grid Table 7 Colorful Accent 4" w:uiPriority="52"/>
-    <w:lsdException w:name="Grid Table 1 Light Accent 5" w:uiPriority="46"/>
-    <w:lsdException w:name="Grid Table 2 Accent 5" w:uiPriority="47"/>
-    <w:lsdException w:name="Grid Table 3 Accent 5" w:uiPriority="48"/>
-    <w:lsdException w:name="Grid Table 4 Accent 5" w:uiPriority="49"/>
-    <w:lsdException w:name="Grid Table 5 Dark Accent 5" w:uiPriority="50"/>
-    <w:lsdException w:name="Grid Table 6 Colorful Accent 5" w:uiPriority="51"/>
-    <w:lsdException w:name="Grid Table 7 Colorful Accent 5" w:uiPriority="52"/>
-    <w:lsdException w:name="Grid Table 1 Light Accent 6" w:uiPriority="46"/>
-    <w:lsdException w:name="Grid Table 2 Accent 6" w:uiPriority="47"/>
-    <w:lsdException w:name="Grid Table 3 Accent 6" w:uiPriority="48"/>
-    <w:lsdException w:name="Grid Table 4 Accent 6" w:uiPriority="49"/>
-    <w:lsdException w:name="Grid Table 5 Dark Accent 6" w:uiPriority="50"/>
-    <w:lsdException w:name="Grid Table 6 Colorful Accent 6" w:uiPriority="51"/>
-    <w:lsdException w:name="Grid Table 7 Colorful Accent 6" w:uiPriority="52"/>
-    <w:lsdException w:name="List Table 1 Light" w:uiPriority="46"/>
-    <w:lsdException w:name="List Table 2" w:uiPriority="47"/>
-    <w:lsdException w:name="List Table 3" w:uiPriority="48"/>
-    <w:lsdException w:name="List Table 4" w:uiPriority="49"/>
-    <w:lsdException w:name="List Table 5 Dark" w:uiPriority="50"/>
-    <w:lsdException w:name="List Table 6 Colorful" w:uiPriority="51"/>
-    <w:lsdException w:name="List Table 7 Colorful" w:uiPriority="52"/>
-    <w:lsdException w:name="List Table 1 Light Accent 1" w:uiPriority="46"/>
-    <w:lsdException w:name="List Table 2 Accent 1" w:uiPriority="47"/>
-    <w:lsdException w:name="List Table 3 Accent 1" w:uiPriority="48"/>
-    <w:lsdException w:name="List Table 4 Accent 1" w:uiPriority="49"/>
-    <w:lsdException w:name="List Table 5 Dark Accent 1" w:uiPriority="50"/>
-    <w:lsdException w:name="List Table 6 Colorful Accent 1" w:uiPriority="51"/>
-    <w:lsdException w:name="List Table 7 Colorful Accent 1" w:uiPriority="52"/>
-    <w:lsdException w:name="List Table 1 Light Accent 2" w:uiPriority="46"/>
-    <w:lsdException w:name="List Table 2 Accent 2" w:uiPriority="47"/>
-    <w:lsdException w:name="List Table 3 Accent 2" w:uiPriority="48"/>
-    <w:lsdException w:name="List Table 4 Accent 2" w:uiPriority="49"/>
-    <w:lsdException w:name="List Table 5 Dark Accent 2" w:uiPriority="50"/>
-    <w:lsdException w:name="List Table 6 Colorful Accent 2" w:uiPriority="51"/>
-    <w:lsdException w:name="List Table 7 Colorful Accent 2" w:uiPriority="52"/>
-    <w:lsdException w:name="List Table 1 Light Accent 3" w:uiPriority="46"/>
-    <w:lsdException w:name="List Table 2 Accent 3" w:uiPriority="47"/>
-    <w:lsdException w:name="List Table 3 Accent 3" w:uiPriority="48"/>
-    <w:lsdException w:name="List Table 4 Accent 3" w:uiPriority="49"/>
-    <w:lsdException w:name="List Table 5 Dark Accent 3" w:uiPriority="50"/>
-    <w:lsdException w:name="List Table 6 Colorful Accent 3" w:uiPriority="51"/>
-    <w:lsdException w:name="List Table 7 Colorful Accent 3" w:uiPriority="52"/>
-    <w:lsdException w:name="List Table 1 Light Accent 4" w:uiPriority="46"/>
-    <w:lsdException w:name="List Table 2 Accent 4" w:uiPriority="47"/>
-    <w:lsdException w:name="List Table 3 Accent 4" w:uiPriority="48"/>
-    <w:lsdException w:name="List Table 4 Accent 4" w:uiPriority="49"/>
-    <w:lsdException w:name="List Table 5 Dark Accent 4" w:uiPriority="50"/>
-    <w:lsdException w:name="List Table 6 Colorful Accent 4" w:uiPriority="51"/>
-    <w:lsdException w:name="List Table 7 Colorful Accent 4" w:uiPriority="52"/>
-    <w:lsdException w:name="List Table 1 Light Accent 5" w:uiPriority="46"/>
-    <w:lsdException w:name="List Table 2 Accent 5" w:uiPriority="47"/>
-    <w:lsdException w:name="List Table 3 Accent 5" w:uiPriority="48"/>
-    <w:lsdException w:name="List Table 4 Accent 5" w:uiPriority="49"/>
-    <w:lsdException w:name="List Table 5 Dark Accent 5" w:uiPriority="50"/>
-    <w:lsdException w:name="List Table 6 Colorful Accent 5" w:uiPriority="51"/>
-    <w:lsdException w:name="List Table 7 Colorful Accent 5" w:uiPriority="52"/>
-    <w:lsdException w:name="List Table 1 Light Accent 6" w:uiPriority="46"/>
-    <w:lsdException w:name="List Table 2 Accent 6" w:uiPriority="47"/>
-    <w:lsdException w:name="List Table 3 Accent 6" w:uiPriority="48"/>
-    <w:lsdException w:name="List Table 4 Accent 6" w:uiPriority="49"/>
-    <w:lsdException w:name="List Table 5 Dark Accent 6" w:uiPriority="50"/>
-    <w:lsdException w:name="List Table 6 Colorful Accent 6" w:uiPriority="51"/>
-    <w:lsdException w:name="List Table 7 Colorful Accent 6" w:uiPriority="52"/>
-    <w:lsdException w:name="Mention" w:semiHidden="1" w:uiPriority="99" w:unhideWhenUsed="1"/>
-    <w:lsdException w:name="Smart Hyperlink" w:semiHidden="1" w:uiPriority="99" w:unhideWhenUsed="1"/>
-    <w:lsdException w:name="Hashtag" w:semiHidden="1" w:uiPriority="99" w:unhideWhenUsed="1"/>
-    <w:lsdException w:name="Unresolved Mention" w:semiHidden="1" w:uiPriority="99" w:unhideWhenUsed="1"/>
-    <w:lsdException w:name="Smart Link" w:semiHidden="1" w:uiPriority="99" w:unhideWhenUsed="1"/>
-  </w:latentStyles>
-  <w:style w:type="paragraph" w:default="1" w:styleId="Normal">
+  <w:latentStyles w:count="276" w:defLockedState="0" w:defQFormat="0" w:defSemiHidden="0" w:defUIPriority="0" w:defUnhideWhenUsed="0"/>
+  <w:style w:default="1" w:styleId="Normal" w:type="paragraph">
     <w:name w:val="Normal"/>
     <w:qFormat/>
     <w:rPr>
-      <w:rFonts w:ascii="Segoe UI" w:eastAsia="Segoe UI" w:hAnsi="Segoe UI" w:cs="Segoe UI"/>
+      <w:rFonts w:ascii="Segoe UI" w:cs="Segoe UI" w:eastAsia="Segoe UI" w:hAnsi="Segoe UI"/>
       <w:color w:val="242424"/>
       <w:sz w:val="21"/>
     </w:rPr>
   </w:style>
-  <w:style w:type="paragraph" w:styleId="Heading1">
+  <w:style w:styleId="BodyText" w:type="paragraph">
+    <w:name w:val="Body Text"/>
+    <w:basedOn w:val="Normal"/>
+    <w:link w:val="BodyTextChar"/>
+    <w:qFormat/>
+    <w:pPr>
+      <w:spacing w:after="120" w:before="180"/>
+    </w:pPr>
+    <w:rPr>
+      <w:rFonts w:ascii="Segoe UI" w:cs="Segoe UI" w:eastAsia="Segoe UI" w:hAnsi="Segoe UI"/>
+      <w:color w:val="242424"/>
+      <w:sz w:val="21"/>
+    </w:rPr>
+  </w:style>
+  <w:style w:customStyle="1" w:styleId="FirstParagraph" w:type="paragraph">
+    <w:name w:val="First Paragraph"/>
+    <w:basedOn w:val="BodyText"/>
+    <w:next w:val="BodyText"/>
+    <w:qFormat/>
+    <w:rPr>
+      <w:rFonts w:ascii="Segoe UI" w:cs="Segoe UI" w:eastAsia="Segoe UI" w:hAnsi="Segoe UI"/>
+      <w:color w:val="242424"/>
+      <w:sz w:val="21"/>
+    </w:rPr>
+  </w:style>
+  <w:style w:customStyle="1" w:styleId="Compact" w:type="paragraph">
+    <w:name w:val="Compact"/>
+    <w:basedOn w:val="BodyText"/>
+    <w:qFormat/>
+    <w:pPr>
+      <w:spacing w:after="36" w:before="36"/>
+    </w:pPr>
+    <w:rPr>
+      <w:rFonts w:ascii="Segoe UI" w:cs="Segoe UI" w:eastAsia="Segoe UI" w:hAnsi="Segoe UI"/>
+      <w:color w:val="242424"/>
+      <w:sz w:val="21"/>
+    </w:rPr>
+  </w:style>
+  <w:style w:styleId="Title" w:type="paragraph">
+    <w:name w:val="Title"/>
+    <w:basedOn w:val="Normal"/>
+    <w:next w:val="BodyText"/>
+    <w:link w:val="TitleChar"/>
+    <w:uiPriority w:val="10"/>
+    <w:qFormat/>
+    <w:rsid w:val="00A10FD9"/>
+    <w:pPr>
+      <w:spacing w:after="80" w:line="240" w:lineRule="auto"/>
+      <w:contextualSpacing/>
+      <w:jc w:val="center"/>
+    </w:pPr>
+    <w:rPr>
+      <w:rFonts w:ascii="Segoe UI Semibold" w:cs="Segoe UI Semibold" w:eastAsia="Segoe UI Semibold" w:hAnsi="Segoe UI Semibold"/>
+      <w:color w:val="3B1041"/>
+      <w:sz w:val="48"/>
+      <w:szCs w:val="56"/>
+    </w:rPr>
+  </w:style>
+  <w:style w:customStyle="1" w:styleId="TitleChar" w:type="character">
+    <w:name w:val="Title Char"/>
+    <w:basedOn w:val="DefaultParagraphFont"/>
+    <w:link w:val="Title"/>
+    <w:uiPriority w:val="10"/>
+    <w:rsid w:val="00A10FD9"/>
+    <w:rPr>
+      <w:rFonts w:asciiTheme="majorHAnsi" w:cstheme="majorBidi" w:eastAsiaTheme="majorEastAsia" w:hAnsiTheme="majorHAnsi"/>
+      <w:sz w:val="56"/>
+      <w:szCs w:val="56"/>
+    </w:rPr>
+  </w:style>
+  <w:style w:styleId="Subtitle" w:type="paragraph">
+    <w:name w:val="Subtitle"/>
+    <w:basedOn w:val="Title"/>
+    <w:next w:val="BodyText"/>
+    <w:link w:val="SubtitleChar"/>
+    <w:uiPriority w:val="11"/>
+    <w:qFormat/>
+    <w:rsid w:val="00A10FD9"/>
+    <w:pPr>
+      <w:numPr>
+        <w:ilvl w:val="1"/>
+      </w:numPr>
+    </w:pPr>
+    <w:rPr>
+      <w:rFonts w:cstheme="majorBidi" w:eastAsiaTheme="majorEastAsia"/>
+      <w:spacing w:val="15"/>
+      <w:sz w:val="28"/>
+      <w:szCs w:val="28"/>
+    </w:rPr>
+  </w:style>
+  <w:style w:customStyle="1" w:styleId="SubtitleChar" w:type="character">
+    <w:name w:val="Subtitle Char"/>
+    <w:basedOn w:val="DefaultParagraphFont"/>
+    <w:link w:val="Subtitle"/>
+    <w:uiPriority w:val="11"/>
+    <w:rsid w:val="00A10FD9"/>
+    <w:rPr>
+      <w:rFonts w:cstheme="majorBidi" w:eastAsiaTheme="majorEastAsia"/>
+      <w:color w:themeColor="text1" w:themeTint="A6" w:val="595959"/>
+      <w:spacing w:val="15"/>
+      <w:sz w:val="28"/>
+      <w:szCs w:val="28"/>
+    </w:rPr>
+  </w:style>
+  <w:style w:customStyle="1" w:styleId="Author" w:type="paragraph">
+    <w:name w:val="Author"/>
+    <w:basedOn w:val="Title"/>
+    <w:next w:val="BodyText"/>
+    <w:qFormat/>
+    <w:pPr>
+      <w:keepNext/>
+      <w:keepLines/>
+    </w:pPr>
+    <w:rPr>
+      <w:sz w:val="24"/>
+      <w:szCs w:val="24"/>
+    </w:rPr>
+  </w:style>
+  <w:style w:styleId="Date" w:type="paragraph">
+    <w:name w:val="Date"/>
+    <w:basedOn w:val="Title"/>
+    <w:next w:val="BodyText"/>
+    <w:qFormat/>
+    <w:pPr>
+      <w:keepNext/>
+      <w:keepLines/>
+    </w:pPr>
+    <w:rPr>
+      <w:sz w:val="24"/>
+      <w:szCs w:val="24"/>
+    </w:rPr>
+  </w:style>
+  <w:style w:customStyle="1" w:styleId="AbstractTitle" w:type="paragraph">
+    <w:name w:val="Abstract Title"/>
+    <w:basedOn w:val="Normal"/>
+    <w:next w:val="Abstract"/>
+    <w:qFormat/>
+    <w:pPr>
+      <w:keepNext/>
+      <w:keepLines/>
+      <w:spacing w:after="0" w:before="300"/>
+      <w:jc w:val="center"/>
+    </w:pPr>
+    <w:rPr>
+      <w:b/>
+      <w:sz w:val="20"/>
+      <w:szCs w:val="20"/>
+    </w:rPr>
+  </w:style>
+  <w:style w:customStyle="1" w:styleId="Abstract" w:type="paragraph">
+    <w:name w:val="Abstract"/>
+    <w:basedOn w:val="Normal"/>
+    <w:next w:val="BodyText"/>
+    <w:qFormat/>
+    <w:pPr>
+      <w:keepNext/>
+      <w:keepLines/>
+      <w:spacing w:after="300" w:before="100"/>
+    </w:pPr>
+    <w:rPr>
+      <w:sz w:val="20"/>
+      <w:szCs w:val="20"/>
+    </w:rPr>
+  </w:style>
+  <w:style w:styleId="Bibliography" w:type="paragraph">
+    <w:name w:val="Bibliography"/>
+    <w:basedOn w:val="Normal"/>
+    <w:next w:val="Bibliography"/>
+    <w:qFormat/>
+    <w:pPr/>
+    <w:rPr/>
+  </w:style>
+  <w:style w:styleId="Heading1" w:type="paragraph">
     <w:name w:val="heading 1"/>
     <w:basedOn w:val="Normal"/>
     <w:next w:val="BodyText"/>
@@ -1593,17 +1646,19 @@
     <w:pPr>
       <w:keepNext/>
       <w:keepLines/>
-      <w:spacing w:before="240" w:after="80"/>
+      <w:spacing w:after="80" w:before="240"/>
       <w:outlineLvl w:val="0"/>
     </w:pPr>
     <w:rPr>
-      <w:rFonts w:ascii="Segoe UI Semibold" w:eastAsia="Segoe UI Semibold" w:hAnsi="Segoe UI Semibold" w:cs="Segoe UI Semibold"/>
+      <w:rFonts w:ascii="Segoe UI Semibold" w:cs="Segoe UI Semibold" w:eastAsia="Segoe UI Semibold" w:hAnsi="Segoe UI Semibold"/>
+      <w:b w:val="0"/>
+      <w:i w:val="0"/>
       <w:color w:val="3B1041"/>
       <w:sz w:val="40"/>
       <w:szCs w:val="40"/>
     </w:rPr>
   </w:style>
-  <w:style w:type="paragraph" w:styleId="Heading2">
+  <w:style w:styleId="Heading2" w:type="paragraph">
     <w:name w:val="heading 2"/>
     <w:basedOn w:val="Normal"/>
     <w:next w:val="BodyText"/>
@@ -1616,17 +1671,19 @@
     <w:pPr>
       <w:keepNext/>
       <w:keepLines/>
-      <w:spacing w:before="280" w:after="80"/>
+      <w:spacing w:after="80" w:before="280"/>
       <w:outlineLvl w:val="1"/>
     </w:pPr>
     <w:rPr>
-      <w:rFonts w:ascii="Segoe UI Semibold" w:eastAsia="Segoe UI Semibold" w:hAnsi="Segoe UI Semibold" w:cs="Segoe UI Semibold"/>
+      <w:rFonts w:ascii="Segoe UI Semibold" w:cs="Segoe UI Semibold" w:eastAsia="Segoe UI Semibold" w:hAnsi="Segoe UI Semibold"/>
+      <w:b w:val="0"/>
+      <w:i w:val="0"/>
       <w:color w:val="3B1041"/>
       <w:sz w:val="30"/>
       <w:szCs w:val="32"/>
     </w:rPr>
   </w:style>
-  <w:style w:type="paragraph" w:styleId="Heading3">
+  <w:style w:styleId="Heading3" w:type="paragraph">
     <w:name w:val="heading 3"/>
     <w:basedOn w:val="Normal"/>
     <w:next w:val="BodyText"/>
@@ -1639,17 +1696,19 @@
     <w:pPr>
       <w:keepNext/>
       <w:keepLines/>
-      <w:spacing w:before="200" w:after="80"/>
+      <w:spacing w:after="80" w:before="200"/>
       <w:outlineLvl w:val="2"/>
     </w:pPr>
     <w:rPr>
-      <w:rFonts w:ascii="Segoe UI Semibold" w:eastAsia="Segoe UI Semibold" w:hAnsi="Segoe UI Semibold" w:cs="Segoe UI Semibold"/>
+      <w:rFonts w:ascii="Segoe UI Semibold" w:cs="Segoe UI Semibold" w:eastAsia="Segoe UI Semibold" w:hAnsi="Segoe UI Semibold"/>
+      <w:b w:val="0"/>
+      <w:i w:val="0"/>
       <w:color w:val="3B1041"/>
       <w:sz w:val="25"/>
       <w:szCs w:val="28"/>
     </w:rPr>
   </w:style>
-  <w:style w:type="paragraph" w:styleId="Heading4">
+  <w:style w:styleId="Heading4" w:type="paragraph">
     <w:name w:val="heading 4"/>
     <w:basedOn w:val="Normal"/>
     <w:next w:val="BodyText"/>
@@ -1662,16 +1721,19 @@
     <w:pPr>
       <w:keepNext/>
       <w:keepLines/>
-      <w:spacing w:before="160" w:after="80"/>
+      <w:spacing w:after="80" w:before="160"/>
       <w:outlineLvl w:val="3"/>
     </w:pPr>
     <w:rPr>
-      <w:rFonts w:ascii="Segoe UI Semibold" w:eastAsia="Segoe UI Semibold" w:hAnsi="Segoe UI Semibold" w:cs="Segoe UI Semibold"/>
+      <w:rFonts w:ascii="Segoe UI Semibold" w:cs="Segoe UI Semibold" w:eastAsia="Segoe UI Semibold" w:hAnsi="Segoe UI Semibold"/>
+      <w:b w:val="0"/>
+      <w:i w:val="0"/>
       <w:iCs/>
+      <w:color w:val="242424"/>
       <w:sz w:val="22"/>
     </w:rPr>
   </w:style>
-  <w:style w:type="paragraph" w:styleId="Heading5">
+  <w:style w:styleId="Heading5" w:type="paragraph">
     <w:name w:val="heading 5"/>
     <w:basedOn w:val="Normal"/>
     <w:next w:val="BodyText"/>
@@ -1684,14 +1746,18 @@
     <w:pPr>
       <w:keepNext/>
       <w:keepLines/>
-      <w:spacing w:before="120" w:after="80"/>
+      <w:spacing w:after="80" w:before="120"/>
       <w:outlineLvl w:val="4"/>
     </w:pPr>
     <w:rPr>
-      <w:rFonts w:ascii="Segoe UI Semibold" w:eastAsia="Segoe UI Semibold" w:hAnsi="Segoe UI Semibold" w:cs="Segoe UI Semibold"/>
-    </w:rPr>
-  </w:style>
-  <w:style w:type="paragraph" w:styleId="Heading6">
+      <w:rFonts w:ascii="Segoe UI Semibold" w:cs="Segoe UI Semibold" w:eastAsia="Segoe UI Semibold" w:hAnsi="Segoe UI Semibold"/>
+      <w:b w:val="0"/>
+      <w:i w:val="0"/>
+      <w:color w:val="242424"/>
+      <w:sz w:val="21"/>
+    </w:rPr>
+  </w:style>
+  <w:style w:styleId="Heading6" w:type="paragraph">
     <w:name w:val="heading 6"/>
     <w:basedOn w:val="Normal"/>
     <w:next w:val="BodyText"/>
@@ -1704,17 +1770,17 @@
     <w:pPr>
       <w:keepNext/>
       <w:keepLines/>
-      <w:spacing w:before="40" w:after="0"/>
+      <w:spacing w:after="0" w:before="40"/>
       <w:outlineLvl w:val="5"/>
     </w:pPr>
     <w:rPr>
-      <w:rFonts w:eastAsiaTheme="majorEastAsia" w:cstheme="majorBidi"/>
+      <w:rFonts w:cstheme="majorBidi" w:eastAsiaTheme="majorEastAsia"/>
       <w:i/>
       <w:iCs/>
-      <w:color w:val="595959" w:themeColor="text1" w:themeTint="A6"/>
-    </w:rPr>
-  </w:style>
-  <w:style w:type="paragraph" w:styleId="Heading7">
+      <w:color w:themeColor="text1" w:themeTint="A6" w:val="595959"/>
+    </w:rPr>
+  </w:style>
+  <w:style w:styleId="Heading7" w:type="paragraph">
     <w:name w:val="heading 7"/>
     <w:basedOn w:val="Normal"/>
     <w:next w:val="BodyText"/>
@@ -1727,15 +1793,15 @@
     <w:pPr>
       <w:keepNext/>
       <w:keepLines/>
-      <w:spacing w:before="40" w:after="0"/>
+      <w:spacing w:after="0" w:before="40"/>
       <w:outlineLvl w:val="6"/>
     </w:pPr>
     <w:rPr>
-      <w:rFonts w:eastAsiaTheme="majorEastAsia" w:cstheme="majorBidi"/>
-      <w:color w:val="595959" w:themeColor="text1" w:themeTint="A6"/>
-    </w:rPr>
-  </w:style>
-  <w:style w:type="paragraph" w:styleId="Heading8">
+      <w:rFonts w:cstheme="majorBidi" w:eastAsiaTheme="majorEastAsia"/>
+      <w:color w:themeColor="text1" w:themeTint="A6" w:val="595959"/>
+    </w:rPr>
+  </w:style>
+  <w:style w:styleId="Heading8" w:type="paragraph">
     <w:name w:val="heading 8"/>
     <w:basedOn w:val="Normal"/>
     <w:next w:val="BodyText"/>
@@ -1752,13 +1818,13 @@
       <w:outlineLvl w:val="7"/>
     </w:pPr>
     <w:rPr>
-      <w:rFonts w:eastAsiaTheme="majorEastAsia" w:cstheme="majorBidi"/>
+      <w:rFonts w:cstheme="majorBidi" w:eastAsiaTheme="majorEastAsia"/>
       <w:i/>
       <w:iCs/>
-      <w:color w:val="272727" w:themeColor="text1" w:themeTint="D8"/>
-    </w:rPr>
-  </w:style>
-  <w:style w:type="paragraph" w:styleId="Heading9">
+      <w:color w:themeColor="text1" w:themeTint="D8" w:val="272727"/>
+    </w:rPr>
+  </w:style>
+  <w:style w:styleId="Heading9" w:type="paragraph">
     <w:name w:val="heading 9"/>
     <w:basedOn w:val="Normal"/>
     <w:next w:val="BodyText"/>
@@ -1775,204 +1841,24 @@
       <w:outlineLvl w:val="8"/>
     </w:pPr>
     <w:rPr>
-      <w:rFonts w:eastAsiaTheme="majorEastAsia" w:cstheme="majorBidi"/>
-      <w:color w:val="272727" w:themeColor="text1" w:themeTint="D8"/>
-    </w:rPr>
-  </w:style>
-  <w:style w:type="character" w:default="1" w:styleId="DefaultParagraphFont">
-    <w:name w:val="Default Paragraph Font"/>
-    <w:uiPriority w:val="1"/>
-    <w:semiHidden/>
-    <w:unhideWhenUsed/>
-  </w:style>
-  <w:style w:type="table" w:default="1" w:styleId="TableNormal">
-    <w:name w:val="Normal Table"/>
-    <w:uiPriority w:val="99"/>
-    <w:semiHidden/>
-    <w:unhideWhenUsed/>
-    <w:tblPr>
-      <w:tblInd w:w="0" w:type="dxa"/>
-      <w:tblCellMar>
-        <w:top w:w="0" w:type="dxa"/>
-        <w:left w:w="108" w:type="dxa"/>
-        <w:bottom w:w="0" w:type="dxa"/>
-        <w:right w:w="108" w:type="dxa"/>
-      </w:tblCellMar>
-    </w:tblPr>
-  </w:style>
-  <w:style w:type="numbering" w:default="1" w:styleId="NoList">
-    <w:name w:val="No List"/>
-    <w:uiPriority w:val="99"/>
-    <w:semiHidden/>
-    <w:unhideWhenUsed/>
-  </w:style>
-  <w:style w:type="paragraph" w:styleId="BodyText">
-    <w:name w:val="Body Text"/>
-    <w:basedOn w:val="Normal"/>
-    <w:qFormat/>
-    <w:pPr>
-      <w:spacing w:before="180" w:after="120"/>
-    </w:pPr>
-  </w:style>
-  <w:style w:type="paragraph" w:customStyle="1" w:styleId="FirstParagraph">
-    <w:name w:val="First Paragraph"/>
-    <w:basedOn w:val="BodyText"/>
-    <w:next w:val="BodyText"/>
-    <w:qFormat/>
-  </w:style>
-  <w:style w:type="paragraph" w:customStyle="1" w:styleId="Compact">
-    <w:name w:val="Compact"/>
-    <w:basedOn w:val="BodyText"/>
-    <w:qFormat/>
-    <w:pPr>
-      <w:spacing w:before="36" w:after="36"/>
-    </w:pPr>
-  </w:style>
-  <w:style w:type="paragraph" w:styleId="Title">
-    <w:name w:val="Title"/>
-    <w:basedOn w:val="Normal"/>
-    <w:next w:val="BodyText"/>
-    <w:link w:val="TitleChar"/>
-    <w:uiPriority w:val="10"/>
-    <w:qFormat/>
-    <w:rsid w:val="00A10FD9"/>
-    <w:pPr>
-      <w:spacing w:after="80"/>
-      <w:contextualSpacing/>
-      <w:jc w:val="center"/>
-    </w:pPr>
-    <w:rPr>
-      <w:rFonts w:ascii="Segoe UI Semibold" w:eastAsia="Segoe UI Semibold" w:hAnsi="Segoe UI Semibold" w:cs="Segoe UI Semibold"/>
-      <w:color w:val="3B1041"/>
-      <w:sz w:val="48"/>
-      <w:szCs w:val="56"/>
-    </w:rPr>
-  </w:style>
-  <w:style w:type="character" w:customStyle="1" w:styleId="TitleChar">
-    <w:name w:val="Title Char"/>
-    <w:basedOn w:val="DefaultParagraphFont"/>
-    <w:link w:val="Title"/>
-    <w:uiPriority w:val="10"/>
-    <w:rsid w:val="00A10FD9"/>
-    <w:rPr>
-      <w:rFonts w:asciiTheme="majorHAnsi" w:eastAsiaTheme="majorEastAsia" w:hAnsiTheme="majorHAnsi" w:cstheme="majorBidi"/>
-      <w:sz w:val="56"/>
-      <w:szCs w:val="56"/>
-    </w:rPr>
-  </w:style>
-  <w:style w:type="paragraph" w:styleId="Subtitle">
-    <w:name w:val="Subtitle"/>
-    <w:basedOn w:val="Title"/>
-    <w:next w:val="BodyText"/>
-    <w:link w:val="SubtitleChar"/>
-    <w:uiPriority w:val="11"/>
-    <w:qFormat/>
-    <w:rsid w:val="00A10FD9"/>
-    <w:pPr>
-      <w:numPr>
-        <w:ilvl w:val="1"/>
-      </w:numPr>
-    </w:pPr>
-    <w:rPr>
-      <w:rFonts w:eastAsiaTheme="majorEastAsia" w:cstheme="majorBidi"/>
-      <w:spacing w:val="15"/>
-      <w:sz w:val="28"/>
-      <w:szCs w:val="28"/>
-    </w:rPr>
-  </w:style>
-  <w:style w:type="character" w:customStyle="1" w:styleId="SubtitleChar">
-    <w:name w:val="Subtitle Char"/>
-    <w:basedOn w:val="DefaultParagraphFont"/>
-    <w:link w:val="Subtitle"/>
-    <w:uiPriority w:val="11"/>
-    <w:rsid w:val="00A10FD9"/>
-    <w:rPr>
-      <w:rFonts w:eastAsiaTheme="majorEastAsia" w:cstheme="majorBidi"/>
-      <w:color w:val="595959" w:themeColor="text1" w:themeTint="A6"/>
-      <w:spacing w:val="15"/>
-      <w:sz w:val="28"/>
-      <w:szCs w:val="28"/>
-    </w:rPr>
-  </w:style>
-  <w:style w:type="paragraph" w:customStyle="1" w:styleId="Author">
-    <w:name w:val="Author"/>
-    <w:basedOn w:val="Title"/>
-    <w:next w:val="BodyText"/>
-    <w:qFormat/>
-    <w:pPr>
-      <w:keepNext/>
-      <w:keepLines/>
-    </w:pPr>
-    <w:rPr>
-      <w:sz w:val="24"/>
-      <w:szCs w:val="24"/>
-    </w:rPr>
-  </w:style>
-  <w:style w:type="paragraph" w:styleId="Date">
-    <w:name w:val="Date"/>
-    <w:basedOn w:val="Title"/>
-    <w:next w:val="BodyText"/>
-    <w:qFormat/>
-    <w:pPr>
-      <w:keepNext/>
-      <w:keepLines/>
-    </w:pPr>
-    <w:rPr>
-      <w:sz w:val="24"/>
-      <w:szCs w:val="24"/>
-    </w:rPr>
-  </w:style>
-  <w:style w:type="paragraph" w:customStyle="1" w:styleId="AbstractTitle">
-    <w:name w:val="Abstract Title"/>
-    <w:basedOn w:val="Normal"/>
-    <w:next w:val="Abstract"/>
-    <w:qFormat/>
-    <w:pPr>
-      <w:keepNext/>
-      <w:keepLines/>
-      <w:spacing w:before="300" w:after="0"/>
-      <w:jc w:val="center"/>
-    </w:pPr>
-    <w:rPr>
-      <w:b/>
-      <w:sz w:val="20"/>
-      <w:szCs w:val="20"/>
-    </w:rPr>
-  </w:style>
-  <w:style w:type="paragraph" w:customStyle="1" w:styleId="Abstract">
-    <w:name w:val="Abstract"/>
-    <w:basedOn w:val="Normal"/>
-    <w:next w:val="BodyText"/>
-    <w:qFormat/>
-    <w:pPr>
-      <w:keepNext/>
-      <w:keepLines/>
-      <w:spacing w:before="100" w:after="300"/>
-    </w:pPr>
-    <w:rPr>
-      <w:sz w:val="20"/>
-      <w:szCs w:val="20"/>
-    </w:rPr>
-  </w:style>
-  <w:style w:type="paragraph" w:styleId="Bibliography">
-    <w:name w:val="Bibliography"/>
-    <w:basedOn w:val="Normal"/>
-    <w:qFormat/>
-  </w:style>
-  <w:style w:type="character" w:customStyle="1" w:styleId="Heading1Char">
+      <w:rFonts w:cstheme="majorBidi" w:eastAsiaTheme="majorEastAsia"/>
+      <w:color w:themeColor="text1" w:themeTint="D8" w:val="272727"/>
+    </w:rPr>
+  </w:style>
+  <w:style w:customStyle="1" w:styleId="Heading1Char" w:type="character">
     <w:name w:val="Heading 1 Char"/>
     <w:basedOn w:val="DefaultParagraphFont"/>
     <w:link w:val="Heading1"/>
     <w:uiPriority w:val="9"/>
     <w:rsid w:val="00A10FD9"/>
     <w:rPr>
-      <w:rFonts w:asciiTheme="majorHAnsi" w:eastAsiaTheme="majorEastAsia" w:hAnsiTheme="majorHAnsi" w:cstheme="majorBidi"/>
-      <w:color w:val="0F4761" w:themeColor="accent1" w:themeShade="BF"/>
+      <w:rFonts w:asciiTheme="majorHAnsi" w:cstheme="majorBidi" w:eastAsiaTheme="majorEastAsia" w:hAnsiTheme="majorHAnsi"/>
+      <w:color w:themeColor="accent1" w:themeShade="BF" w:val="0F4761"/>
       <w:sz w:val="40"/>
       <w:szCs w:val="40"/>
     </w:rPr>
   </w:style>
-  <w:style w:type="character" w:customStyle="1" w:styleId="Heading2Char">
+  <w:style w:customStyle="1" w:styleId="Heading2Char" w:type="character">
     <w:name w:val="Heading 2 Char"/>
     <w:basedOn w:val="DefaultParagraphFont"/>
     <w:link w:val="Heading2"/>
@@ -1980,13 +1866,13 @@
     <w:semiHidden/>
     <w:rsid w:val="00A10FD9"/>
     <w:rPr>
-      <w:rFonts w:asciiTheme="majorHAnsi" w:eastAsiaTheme="majorEastAsia" w:hAnsiTheme="majorHAnsi" w:cstheme="majorBidi"/>
-      <w:color w:val="0F4761" w:themeColor="accent1" w:themeShade="BF"/>
+      <w:rFonts w:asciiTheme="majorHAnsi" w:cstheme="majorBidi" w:eastAsiaTheme="majorEastAsia" w:hAnsiTheme="majorHAnsi"/>
+      <w:color w:themeColor="accent1" w:themeShade="BF" w:val="0F4761"/>
       <w:sz w:val="32"/>
       <w:szCs w:val="32"/>
     </w:rPr>
   </w:style>
-  <w:style w:type="character" w:customStyle="1" w:styleId="Heading3Char">
+  <w:style w:customStyle="1" w:styleId="Heading3Char" w:type="character">
     <w:name w:val="Heading 3 Char"/>
     <w:basedOn w:val="DefaultParagraphFont"/>
     <w:link w:val="Heading3"/>
@@ -1994,13 +1880,13 @@
     <w:semiHidden/>
     <w:rsid w:val="00A10FD9"/>
     <w:rPr>
-      <w:rFonts w:eastAsiaTheme="majorEastAsia" w:cstheme="majorBidi"/>
-      <w:color w:val="0F4761" w:themeColor="accent1" w:themeShade="BF"/>
+      <w:rFonts w:cstheme="majorBidi" w:eastAsiaTheme="majorEastAsia"/>
+      <w:color w:themeColor="accent1" w:themeShade="BF" w:val="0F4761"/>
       <w:sz w:val="28"/>
       <w:szCs w:val="28"/>
     </w:rPr>
   </w:style>
-  <w:style w:type="character" w:customStyle="1" w:styleId="Heading4Char">
+  <w:style w:customStyle="1" w:styleId="Heading4Char" w:type="character">
     <w:name w:val="Heading 4 Char"/>
     <w:basedOn w:val="DefaultParagraphFont"/>
     <w:link w:val="Heading4"/>
@@ -2008,13 +1894,13 @@
     <w:semiHidden/>
     <w:rsid w:val="00A10FD9"/>
     <w:rPr>
-      <w:rFonts w:eastAsiaTheme="majorEastAsia" w:cstheme="majorBidi"/>
+      <w:rFonts w:cstheme="majorBidi" w:eastAsiaTheme="majorEastAsia"/>
       <w:i/>
       <w:iCs/>
-      <w:color w:val="0F4761" w:themeColor="accent1" w:themeShade="BF"/>
-    </w:rPr>
-  </w:style>
-  <w:style w:type="character" w:customStyle="1" w:styleId="Heading5Char">
+      <w:color w:themeColor="accent1" w:themeShade="BF" w:val="0F4761"/>
+    </w:rPr>
+  </w:style>
+  <w:style w:customStyle="1" w:styleId="Heading5Char" w:type="character">
     <w:name w:val="Heading 5 Char"/>
     <w:basedOn w:val="DefaultParagraphFont"/>
     <w:link w:val="Heading5"/>
@@ -2022,11 +1908,11 @@
     <w:semiHidden/>
     <w:rsid w:val="00A10FD9"/>
     <w:rPr>
-      <w:rFonts w:eastAsiaTheme="majorEastAsia" w:cstheme="majorBidi"/>
-      <w:color w:val="0F4761" w:themeColor="accent1" w:themeShade="BF"/>
-    </w:rPr>
-  </w:style>
-  <w:style w:type="character" w:customStyle="1" w:styleId="Heading6Char">
+      <w:rFonts w:cstheme="majorBidi" w:eastAsiaTheme="majorEastAsia"/>
+      <w:color w:themeColor="accent1" w:themeShade="BF" w:val="0F4761"/>
+    </w:rPr>
+  </w:style>
+  <w:style w:customStyle="1" w:styleId="Heading6Char" w:type="character">
     <w:name w:val="Heading 6 Char"/>
     <w:basedOn w:val="DefaultParagraphFont"/>
     <w:link w:val="Heading6"/>
@@ -2034,13 +1920,13 @@
     <w:semiHidden/>
     <w:rsid w:val="00A10FD9"/>
     <w:rPr>
-      <w:rFonts w:eastAsiaTheme="majorEastAsia" w:cstheme="majorBidi"/>
+      <w:rFonts w:cstheme="majorBidi" w:eastAsiaTheme="majorEastAsia"/>
       <w:i/>
       <w:iCs/>
-      <w:color w:val="595959" w:themeColor="text1" w:themeTint="A6"/>
-    </w:rPr>
-  </w:style>
-  <w:style w:type="character" w:customStyle="1" w:styleId="Heading7Char">
+      <w:color w:themeColor="text1" w:themeTint="A6" w:val="595959"/>
+    </w:rPr>
+  </w:style>
+  <w:style w:customStyle="1" w:styleId="Heading7Char" w:type="character">
     <w:name w:val="Heading 7 Char"/>
     <w:basedOn w:val="DefaultParagraphFont"/>
     <w:link w:val="Heading7"/>
@@ -2048,11 +1934,11 @@
     <w:semiHidden/>
     <w:rsid w:val="00A10FD9"/>
     <w:rPr>
-      <w:rFonts w:eastAsiaTheme="majorEastAsia" w:cstheme="majorBidi"/>
-      <w:color w:val="595959" w:themeColor="text1" w:themeTint="A6"/>
-    </w:rPr>
-  </w:style>
-  <w:style w:type="character" w:customStyle="1" w:styleId="Heading8Char">
+      <w:rFonts w:cstheme="majorBidi" w:eastAsiaTheme="majorEastAsia"/>
+      <w:color w:themeColor="text1" w:themeTint="A6" w:val="595959"/>
+    </w:rPr>
+  </w:style>
+  <w:style w:customStyle="1" w:styleId="Heading8Char" w:type="character">
     <w:name w:val="Heading 8 Char"/>
     <w:basedOn w:val="DefaultParagraphFont"/>
     <w:link w:val="Heading8"/>
@@ -2060,13 +1946,13 @@
     <w:semiHidden/>
     <w:rsid w:val="00A10FD9"/>
     <w:rPr>
-      <w:rFonts w:eastAsiaTheme="majorEastAsia" w:cstheme="majorBidi"/>
+      <w:rFonts w:cstheme="majorBidi" w:eastAsiaTheme="majorEastAsia"/>
       <w:i/>
       <w:iCs/>
-      <w:color w:val="272727" w:themeColor="text1" w:themeTint="D8"/>
-    </w:rPr>
-  </w:style>
-  <w:style w:type="character" w:customStyle="1" w:styleId="Heading9Char">
+      <w:color w:themeColor="text1" w:themeTint="D8" w:val="272727"/>
+    </w:rPr>
+  </w:style>
+  <w:style w:customStyle="1" w:styleId="Heading9Char" w:type="character">
     <w:name w:val="Heading 9 Char"/>
     <w:basedOn w:val="DefaultParagraphFont"/>
     <w:link w:val="Heading9"/>
@@ -2074,11 +1960,11 @@
     <w:semiHidden/>
     <w:rsid w:val="00A10FD9"/>
     <w:rPr>
-      <w:rFonts w:eastAsiaTheme="majorEastAsia" w:cstheme="majorBidi"/>
-      <w:color w:val="272727" w:themeColor="text1" w:themeTint="D8"/>
-    </w:rPr>
-  </w:style>
-  <w:style w:type="paragraph" w:styleId="BlockText">
+      <w:rFonts w:cstheme="majorBidi" w:eastAsiaTheme="majorEastAsia"/>
+      <w:color w:themeColor="text1" w:themeTint="D8" w:val="272727"/>
+    </w:rPr>
+  </w:style>
+  <w:style w:styleId="BlockText" w:type="paragraph">
     <w:name w:val="Block Text"/>
     <w:basedOn w:val="BodyText"/>
     <w:next w:val="BodyText"/>
@@ -2086,22 +1972,29 @@
     <w:unhideWhenUsed/>
     <w:qFormat/>
     <w:pPr>
+      <w:spacing w:after="40" w:before="40"/>
+      <w:ind w:firstLine="0" w:left="288" w:right="144"/>
       <w:pBdr>
-        <w:left w:val="single" w:sz="18" w:space="8" w:color="3B1041"/>
+        <w:left w:color="3B1041" w:space="8" w:sz="18" w:val="single"/>
       </w:pBdr>
-      <w:shd w:val="clear" w:color="auto" w:fill="FBF6FD"/>
-      <w:spacing w:before="40" w:after="40"/>
-      <w:ind w:left="288" w:right="144"/>
+      <w:shd w:color="auto" w:fill="FBF6FD" w:val="clear"/>
     </w:pPr>
-  </w:style>
-  <w:style w:type="paragraph" w:styleId="FootnoteText">
-    <w:name w:val="footnote text"/>
+    <w:rPr>
+      <w:rFonts w:ascii="Segoe UI" w:cs="Segoe UI" w:eastAsia="Segoe UI" w:hAnsi="Segoe UI"/>
+      <w:i w:val="0"/>
+      <w:color w:val="242424"/>
+      <w:sz w:val="21"/>
+    </w:rPr>
+  </w:style>
+  <w:style w:styleId="FootnoteText" w:type="paragraph">
+    <w:name w:val="Footnote Text"/>
     <w:basedOn w:val="Normal"/>
+    <w:next w:val="FootnoteText"/>
     <w:uiPriority w:val="9"/>
     <w:unhideWhenUsed/>
     <w:qFormat/>
   </w:style>
-  <w:style w:type="paragraph" w:customStyle="1" w:styleId="FootnoteBlockText">
+  <w:style w:styleId="FootnoteBlockText" w:type="paragraph">
     <w:name w:val="Footnote Block Text"/>
     <w:basedOn w:val="FootnoteText"/>
     <w:next w:val="FootnoteText"/>
@@ -2109,35 +2002,40 @@
     <w:unhideWhenUsed/>
     <w:qFormat/>
     <w:pPr>
-      <w:spacing w:before="100" w:after="100"/>
-      <w:ind w:left="480" w:right="480"/>
+      <w:spacing w:after="100" w:before="100"/>
+      <w:ind w:firstLine="0" w:left="480" w:right="480"/>
     </w:pPr>
   </w:style>
-  <w:style w:type="table" w:customStyle="1" w:styleId="Table">
+  <w:style w:default="1" w:styleId="DefaultParagraphFont" w:type="character">
+    <w:name w:val="Default Paragraph Font"/>
+    <w:semiHidden/>
+    <w:unhideWhenUsed/>
+  </w:style>
+  <w:style w:default="1" w:styleId="Table" w:type="table">
     <w:name w:val="Table"/>
+    <w:basedOn w:val="TableNormal"/>
     <w:semiHidden/>
     <w:unhideWhenUsed/>
     <w:qFormat/>
     <w:tblPr>
-      <w:tblInd w:w="0" w:type="dxa"/>
+      <w:tblInd w:type="dxa" w:w="0"/>
       <w:tblCellMar>
-        <w:top w:w="0" w:type="dxa"/>
-        <w:left w:w="108" w:type="dxa"/>
-        <w:bottom w:w="0" w:type="dxa"/>
-        <w:right w:w="108" w:type="dxa"/>
+        <w:top w:type="dxa" w:w="0"/>
+        <w:left w:type="dxa" w:w="108"/>
+        <w:bottom w:type="dxa" w:w="0"/>
+        <w:right w:type="dxa" w:w="108"/>
       </w:tblCellMar>
     </w:tblPr>
     <w:tblStylePr w:type="firstRow">
-      <w:tblPr/>
       <w:tcPr>
         <w:tcBorders>
-          <w:bottom w:val="single" w:sz="0" w:space="0" w:color="auto"/>
+          <w:bottom w:val="single"/>
         </w:tcBorders>
         <w:vAlign w:val="bottom"/>
       </w:tcPr>
     </w:tblStylePr>
   </w:style>
-  <w:style w:type="paragraph" w:customStyle="1" w:styleId="DefinitionTerm">
+  <w:style w:customStyle="1" w:styleId="DefinitionTerm" w:type="paragraph">
     <w:name w:val="Definition Term"/>
     <w:basedOn w:val="Normal"/>
     <w:next w:val="Definition"/>
@@ -2150,77 +2048,76 @@
       <w:b/>
     </w:rPr>
   </w:style>
-  <w:style w:type="paragraph" w:customStyle="1" w:styleId="Definition">
+  <w:style w:customStyle="1" w:styleId="Definition" w:type="paragraph">
     <w:name w:val="Definition"/>
     <w:basedOn w:val="Normal"/>
   </w:style>
-  <w:style w:type="paragraph" w:styleId="Caption">
-    <w:name w:val="caption"/>
+  <w:style w:styleId="Caption" w:type="paragraph">
+    <w:name w:val="Caption"/>
     <w:basedOn w:val="Normal"/>
-    <w:link w:val="CaptionChar"/>
+    <w:link w:val="BodyTextChar"/>
     <w:pPr>
-      <w:spacing w:after="120"/>
+      <w:spacing w:after="120" w:before="0"/>
     </w:pPr>
     <w:rPr>
       <w:i/>
     </w:rPr>
   </w:style>
-  <w:style w:type="paragraph" w:customStyle="1" w:styleId="TableCaption">
+  <w:style w:customStyle="1" w:styleId="TableCaption" w:type="paragraph">
     <w:name w:val="Table Caption"/>
     <w:basedOn w:val="Caption"/>
     <w:pPr>
       <w:keepNext/>
     </w:pPr>
   </w:style>
-  <w:style w:type="paragraph" w:customStyle="1" w:styleId="ImageCaption">
+  <w:style w:customStyle="1" w:styleId="ImageCaption" w:type="paragraph">
     <w:name w:val="Image Caption"/>
     <w:basedOn w:val="Caption"/>
   </w:style>
-  <w:style w:type="paragraph" w:customStyle="1" w:styleId="Figure">
+  <w:style w:customStyle="1" w:styleId="Figure" w:type="paragraph">
     <w:name w:val="Figure"/>
     <w:basedOn w:val="Normal"/>
   </w:style>
-  <w:style w:type="paragraph" w:customStyle="1" w:styleId="CaptionedFigure">
+  <w:style w:customStyle="1" w:styleId="CaptionedFigure" w:type="paragraph">
     <w:name w:val="Captioned Figure"/>
     <w:basedOn w:val="Figure"/>
     <w:pPr>
       <w:keepNext/>
     </w:pPr>
   </w:style>
-  <w:style w:type="character" w:customStyle="1" w:styleId="CaptionChar">
-    <w:name w:val="Caption Char"/>
+  <w:style w:customStyle="1" w:styleId="BodyTextChar" w:type="character">
+    <w:name w:val="Body Text Char"/>
     <w:basedOn w:val="DefaultParagraphFont"/>
-    <w:link w:val="Caption"/>
-  </w:style>
-  <w:style w:type="character" w:customStyle="1" w:styleId="VerbatimChar">
+    <w:link w:val="BodyText"/>
+  </w:style>
+  <w:style w:customStyle="1" w:styleId="VerbatimChar" w:type="character">
     <w:name w:val="Verbatim Char"/>
-    <w:basedOn w:val="CaptionChar"/>
-    <w:link w:val="SourceCode"/>
-    <w:rPr>
-      <w:rFonts w:ascii="Consolas" w:eastAsia="Consolas" w:hAnsi="Consolas" w:cs="Consolas"/>
+    <w:basedOn w:val="BodyTextChar"/>
+    <w:rPr>
+      <w:rFonts w:ascii="Consolas" w:cs="Consolas" w:eastAsia="Consolas" w:hAnsi="Consolas"/>
       <w:color w:val="5B2A63"/>
       <w:sz w:val="19"/>
     </w:rPr>
   </w:style>
-  <w:style w:type="character" w:customStyle="1" w:styleId="SectionNumber">
+  <w:style w:customStyle="1" w:styleId="SectionNumber" w:type="character">
     <w:name w:val="Section Number"/>
-    <w:basedOn w:val="CaptionChar"/>
-  </w:style>
-  <w:style w:type="character" w:styleId="FootnoteReference">
-    <w:name w:val="footnote reference"/>
-    <w:basedOn w:val="CaptionChar"/>
+    <w:basedOn w:val="BodyTextChar"/>
+  </w:style>
+  <w:style w:styleId="FootnoteReference" w:type="character">
+    <w:name w:val="Footnote Reference"/>
+    <w:basedOn w:val="BodyTextChar"/>
     <w:rPr>
       <w:vertAlign w:val="superscript"/>
     </w:rPr>
   </w:style>
-  <w:style w:type="character" w:styleId="Hyperlink">
+  <w:style w:styleId="Hyperlink" w:type="character">
     <w:name w:val="Hyperlink"/>
-    <w:basedOn w:val="CaptionChar"/>
+    <w:basedOn w:val="BodyTextChar"/>
     <w:rPr>
       <w:color w:val="0F6CBD"/>
     </w:rPr>
   </w:style>
-  <w:style w:type="paragraph" w:styleId="TOCHeading">
+  <w:style w:styleId="TOCHeading" w:type="paragraph">
     <w:name w:val="TOC Heading"/>
     <w:basedOn w:val="Heading1"/>
     <w:next w:val="BodyText"/>
@@ -2228,21 +2125,53 @@
     <w:unhideWhenUsed/>
     <w:qFormat/>
     <w:pPr>
-      <w:spacing w:line="259" w:lineRule="auto"/>
+      <w:spacing w:before="240" w:line="259" w:lineRule="auto"/>
       <w:outlineLvl w:val="9"/>
     </w:pPr>
     <w:rPr>
+      <w:rFonts w:ascii="Segoe UI Semibold" w:cs="Segoe UI Semibold" w:eastAsia="Segoe UI Semibold" w:hAnsi="Segoe UI Semibold"/>
+      <w:b w:val="0"/>
+      <w:bCs w:val="0"/>
+      <w:color w:val="3B1041"/>
       <w:sz w:val="30"/>
     </w:rPr>
   </w:style>
-  <w:style w:type="paragraph" w:customStyle="1" w:styleId="CalloutMarker">
+  <w:style w:customStyle="1" w:styleId="CalloutMarker" w:type="paragraph">
     <w:name w:val="Callout Marker"/>
     <w:basedOn w:val="Normal"/>
     <w:pPr>
-      <w:spacing w:after="0"/>
+      <w:spacing w:after="0" w:before="0"/>
     </w:pPr>
     <w:rPr>
       <w:sz w:val="4"/>
+    </w:rPr>
+  </w:style>
+  <w:style w:customStyle="1" w:styleId="PromptGoal" w:type="character">
+    <w:name w:val="Prompt Goal"/>
+    <w:rPr>
+      <w:color w:val="1F4E99"/>
+      <w:shd w:color="auto" w:fill="DCEBFF" w:val="clear"/>
+    </w:rPr>
+  </w:style>
+  <w:style w:customStyle="1" w:styleId="PromptSource" w:type="character">
+    <w:name w:val="Prompt Source"/>
+    <w:rPr>
+      <w:color w:val="1E6B32"/>
+      <w:shd w:color="auto" w:fill="DFF5E1" w:val="clear"/>
+    </w:rPr>
+  </w:style>
+  <w:style w:customStyle="1" w:styleId="PromptExpectations" w:type="character">
+    <w:name w:val="Prompt Expectations"/>
+    <w:rPr>
+      <w:color w:val="8A4B00"/>
+      <w:shd w:color="auto" w:fill="FFE9CC" w:val="clear"/>
+    </w:rPr>
+  </w:style>
+  <w:style w:customStyle="1" w:styleId="PromptConstraints" w:type="character">
+    <w:name w:val="Prompt Constraints"/>
+    <w:rPr>
+      <w:color w:val="5B2C91"/>
+      <w:shd w:color="auto" w:fill="EDE3FA" w:val="clear"/>
     </w:rPr>
   </w:style>
   <w:style w:type="paragraph" w:customStyle="1" w:styleId="SourceCode">
@@ -2250,350 +2179,234 @@
     <w:basedOn w:val="Normal"/>
     <w:link w:val="VerbatimChar"/>
     <w:pPr>
-      <w:wordWrap w:val="0"/>
+      <w:wordWrap w:val="off"/>
     </w:pPr>
   </w:style>
   <w:style w:type="character" w:customStyle="1" w:styleId="KeywordTok">
     <w:name w:val="KeywordTok"/>
     <w:basedOn w:val="VerbatimChar"/>
     <w:rPr>
-      <w:rFonts w:ascii="Consolas" w:eastAsia="Consolas" w:hAnsi="Consolas" w:cs="Consolas"/>
       <w:b/>
       <w:color w:val="007020"/>
-      <w:sz w:val="19"/>
     </w:rPr>
   </w:style>
   <w:style w:type="character" w:customStyle="1" w:styleId="DataTypeTok">
     <w:name w:val="DataTypeTok"/>
     <w:basedOn w:val="VerbatimChar"/>
     <w:rPr>
-      <w:rFonts w:ascii="Consolas" w:eastAsia="Consolas" w:hAnsi="Consolas" w:cs="Consolas"/>
       <w:color w:val="902000"/>
-      <w:sz w:val="19"/>
     </w:rPr>
   </w:style>
   <w:style w:type="character" w:customStyle="1" w:styleId="DecValTok">
     <w:name w:val="DecValTok"/>
     <w:basedOn w:val="VerbatimChar"/>
     <w:rPr>
-      <w:rFonts w:ascii="Consolas" w:eastAsia="Consolas" w:hAnsi="Consolas" w:cs="Consolas"/>
-      <w:color w:val="40A070"/>
-      <w:sz w:val="19"/>
+      <w:color w:val="40a070"/>
     </w:rPr>
   </w:style>
   <w:style w:type="character" w:customStyle="1" w:styleId="BaseNTok">
     <w:name w:val="BaseNTok"/>
     <w:basedOn w:val="VerbatimChar"/>
     <w:rPr>
-      <w:rFonts w:ascii="Consolas" w:eastAsia="Consolas" w:hAnsi="Consolas" w:cs="Consolas"/>
-      <w:color w:val="40A070"/>
-      <w:sz w:val="19"/>
+      <w:color w:val="40a070"/>
     </w:rPr>
   </w:style>
   <w:style w:type="character" w:customStyle="1" w:styleId="FloatTok">
     <w:name w:val="FloatTok"/>
     <w:basedOn w:val="VerbatimChar"/>
     <w:rPr>
-      <w:rFonts w:ascii="Consolas" w:eastAsia="Consolas" w:hAnsi="Consolas" w:cs="Consolas"/>
-      <w:color w:val="40A070"/>
-      <w:sz w:val="19"/>
+      <w:color w:val="40a070"/>
     </w:rPr>
   </w:style>
   <w:style w:type="character" w:customStyle="1" w:styleId="ConstantTok">
     <w:name w:val="ConstantTok"/>
     <w:basedOn w:val="VerbatimChar"/>
     <w:rPr>
-      <w:rFonts w:ascii="Consolas" w:eastAsia="Consolas" w:hAnsi="Consolas" w:cs="Consolas"/>
       <w:color w:val="880000"/>
-      <w:sz w:val="19"/>
     </w:rPr>
   </w:style>
   <w:style w:type="character" w:customStyle="1" w:styleId="CharTok">
     <w:name w:val="CharTok"/>
     <w:basedOn w:val="VerbatimChar"/>
     <w:rPr>
-      <w:rFonts w:ascii="Consolas" w:eastAsia="Consolas" w:hAnsi="Consolas" w:cs="Consolas"/>
-      <w:color w:val="4070A0"/>
-      <w:sz w:val="19"/>
+      <w:color w:val="4070a0"/>
     </w:rPr>
   </w:style>
   <w:style w:type="character" w:customStyle="1" w:styleId="SpecialCharTok">
     <w:name w:val="SpecialCharTok"/>
     <w:basedOn w:val="VerbatimChar"/>
     <w:rPr>
-      <w:rFonts w:ascii="Consolas" w:eastAsia="Consolas" w:hAnsi="Consolas" w:cs="Consolas"/>
-      <w:color w:val="4070A0"/>
-      <w:sz w:val="19"/>
+      <w:color w:val="4070a0"/>
     </w:rPr>
   </w:style>
   <w:style w:type="character" w:customStyle="1" w:styleId="StringTok">
     <w:name w:val="StringTok"/>
     <w:basedOn w:val="VerbatimChar"/>
     <w:rPr>
-      <w:rFonts w:ascii="Consolas" w:eastAsia="Consolas" w:hAnsi="Consolas" w:cs="Consolas"/>
-      <w:color w:val="4070A0"/>
-      <w:sz w:val="19"/>
+      <w:color w:val="4070a0"/>
     </w:rPr>
   </w:style>
   <w:style w:type="character" w:customStyle="1" w:styleId="VerbatimStringTok">
     <w:name w:val="VerbatimStringTok"/>
     <w:basedOn w:val="VerbatimChar"/>
     <w:rPr>
-      <w:rFonts w:ascii="Consolas" w:eastAsia="Consolas" w:hAnsi="Consolas" w:cs="Consolas"/>
-      <w:color w:val="4070A0"/>
-      <w:sz w:val="19"/>
+      <w:color w:val="4070a0"/>
     </w:rPr>
   </w:style>
   <w:style w:type="character" w:customStyle="1" w:styleId="SpecialStringTok">
     <w:name w:val="SpecialStringTok"/>
     <w:basedOn w:val="VerbatimChar"/>
     <w:rPr>
-      <w:rFonts w:ascii="Consolas" w:eastAsia="Consolas" w:hAnsi="Consolas" w:cs="Consolas"/>
-      <w:color w:val="BB6688"/>
-      <w:sz w:val="19"/>
+      <w:color w:val="bb6688"/>
     </w:rPr>
   </w:style>
   <w:style w:type="character" w:customStyle="1" w:styleId="ImportTok">
     <w:name w:val="ImportTok"/>
     <w:basedOn w:val="VerbatimChar"/>
     <w:rPr>
-      <w:rFonts w:ascii="Consolas" w:eastAsia="Consolas" w:hAnsi="Consolas" w:cs="Consolas"/>
       <w:b/>
       <w:color w:val="008000"/>
-      <w:sz w:val="19"/>
     </w:rPr>
   </w:style>
   <w:style w:type="character" w:customStyle="1" w:styleId="CommentTok">
     <w:name w:val="CommentTok"/>
     <w:basedOn w:val="VerbatimChar"/>
     <w:rPr>
-      <w:rFonts w:ascii="Consolas" w:eastAsia="Consolas" w:hAnsi="Consolas" w:cs="Consolas"/>
       <w:i/>
-      <w:color w:val="60A0B0"/>
-      <w:sz w:val="19"/>
+      <w:color w:val="60a0b0"/>
     </w:rPr>
   </w:style>
   <w:style w:type="character" w:customStyle="1" w:styleId="DocumentationTok">
     <w:name w:val="DocumentationTok"/>
     <w:basedOn w:val="VerbatimChar"/>
     <w:rPr>
-      <w:rFonts w:ascii="Consolas" w:eastAsia="Consolas" w:hAnsi="Consolas" w:cs="Consolas"/>
       <w:i/>
-      <w:color w:val="BA2121"/>
-      <w:sz w:val="19"/>
+      <w:color w:val="ba2121"/>
     </w:rPr>
   </w:style>
   <w:style w:type="character" w:customStyle="1" w:styleId="AnnotationTok">
     <w:name w:val="AnnotationTok"/>
     <w:basedOn w:val="VerbatimChar"/>
     <w:rPr>
-      <w:rFonts w:ascii="Consolas" w:eastAsia="Consolas" w:hAnsi="Consolas" w:cs="Consolas"/>
       <w:b/>
       <w:i/>
-      <w:color w:val="60A0B0"/>
-      <w:sz w:val="19"/>
+      <w:color w:val="60a0b0"/>
     </w:rPr>
   </w:style>
   <w:style w:type="character" w:customStyle="1" w:styleId="CommentVarTok">
     <w:name w:val="CommentVarTok"/>
     <w:basedOn w:val="VerbatimChar"/>
     <w:rPr>
-      <w:rFonts w:ascii="Consolas" w:eastAsia="Consolas" w:hAnsi="Consolas" w:cs="Consolas"/>
       <w:b/>
       <w:i/>
-      <w:color w:val="60A0B0"/>
-      <w:sz w:val="19"/>
+      <w:color w:val="60a0b0"/>
     </w:rPr>
   </w:style>
   <w:style w:type="character" w:customStyle="1" w:styleId="OtherTok">
     <w:name w:val="OtherTok"/>
     <w:basedOn w:val="VerbatimChar"/>
     <w:rPr>
-      <w:rFonts w:ascii="Consolas" w:eastAsia="Consolas" w:hAnsi="Consolas" w:cs="Consolas"/>
       <w:color w:val="007020"/>
-      <w:sz w:val="19"/>
     </w:rPr>
   </w:style>
   <w:style w:type="character" w:customStyle="1" w:styleId="FunctionTok">
     <w:name w:val="FunctionTok"/>
     <w:basedOn w:val="VerbatimChar"/>
     <w:rPr>
-      <w:rFonts w:ascii="Consolas" w:eastAsia="Consolas" w:hAnsi="Consolas" w:cs="Consolas"/>
-      <w:color w:val="06287E"/>
-      <w:sz w:val="19"/>
+      <w:color w:val="06287e"/>
     </w:rPr>
   </w:style>
   <w:style w:type="character" w:customStyle="1" w:styleId="VariableTok">
     <w:name w:val="VariableTok"/>
     <w:basedOn w:val="VerbatimChar"/>
     <w:rPr>
-      <w:rFonts w:ascii="Consolas" w:eastAsia="Consolas" w:hAnsi="Consolas" w:cs="Consolas"/>
-      <w:color w:val="19177C"/>
-      <w:sz w:val="19"/>
+      <w:color w:val="19177c"/>
     </w:rPr>
   </w:style>
   <w:style w:type="character" w:customStyle="1" w:styleId="ControlFlowTok">
     <w:name w:val="ControlFlowTok"/>
     <w:basedOn w:val="VerbatimChar"/>
     <w:rPr>
-      <w:rFonts w:ascii="Consolas" w:eastAsia="Consolas" w:hAnsi="Consolas" w:cs="Consolas"/>
       <w:b/>
       <w:color w:val="007020"/>
-      <w:sz w:val="19"/>
     </w:rPr>
   </w:style>
   <w:style w:type="character" w:customStyle="1" w:styleId="OperatorTok">
     <w:name w:val="OperatorTok"/>
     <w:basedOn w:val="VerbatimChar"/>
     <w:rPr>
-      <w:rFonts w:ascii="Consolas" w:eastAsia="Consolas" w:hAnsi="Consolas" w:cs="Consolas"/>
       <w:color w:val="666666"/>
-      <w:sz w:val="19"/>
     </w:rPr>
   </w:style>
   <w:style w:type="character" w:customStyle="1" w:styleId="BuiltInTok">
     <w:name w:val="BuiltInTok"/>
     <w:basedOn w:val="VerbatimChar"/>
     <w:rPr>
-      <w:rFonts w:ascii="Consolas" w:eastAsia="Consolas" w:hAnsi="Consolas" w:cs="Consolas"/>
       <w:color w:val="008000"/>
-      <w:sz w:val="19"/>
     </w:rPr>
   </w:style>
   <w:style w:type="character" w:customStyle="1" w:styleId="ExtensionTok">
     <w:name w:val="ExtensionTok"/>
     <w:basedOn w:val="VerbatimChar"/>
-    <w:rPr>
-      <w:rFonts w:ascii="Consolas" w:eastAsia="Consolas" w:hAnsi="Consolas" w:cs="Consolas"/>
-      <w:color w:val="5B2A63"/>
-      <w:sz w:val="19"/>
-    </w:rPr>
+    <w:rPr/>
   </w:style>
   <w:style w:type="character" w:customStyle="1" w:styleId="PreprocessorTok">
     <w:name w:val="PreprocessorTok"/>
     <w:basedOn w:val="VerbatimChar"/>
     <w:rPr>
-      <w:rFonts w:ascii="Consolas" w:eastAsia="Consolas" w:hAnsi="Consolas" w:cs="Consolas"/>
-      <w:color w:val="BC7A00"/>
-      <w:sz w:val="19"/>
+      <w:color w:val="bc7a00"/>
     </w:rPr>
   </w:style>
   <w:style w:type="character" w:customStyle="1" w:styleId="AttributeTok">
     <w:name w:val="AttributeTok"/>
     <w:basedOn w:val="VerbatimChar"/>
     <w:rPr>
-      <w:rFonts w:ascii="Consolas" w:eastAsia="Consolas" w:hAnsi="Consolas" w:cs="Consolas"/>
-      <w:color w:val="7D9029"/>
-      <w:sz w:val="19"/>
+      <w:color w:val="7d9029"/>
     </w:rPr>
   </w:style>
   <w:style w:type="character" w:customStyle="1" w:styleId="RegionMarkerTok">
     <w:name w:val="RegionMarkerTok"/>
     <w:basedOn w:val="VerbatimChar"/>
-    <w:rPr>
-      <w:rFonts w:ascii="Consolas" w:eastAsia="Consolas" w:hAnsi="Consolas" w:cs="Consolas"/>
-      <w:color w:val="5B2A63"/>
-      <w:sz w:val="19"/>
-    </w:rPr>
+    <w:rPr/>
   </w:style>
   <w:style w:type="character" w:customStyle="1" w:styleId="InformationTok">
     <w:name w:val="InformationTok"/>
     <w:basedOn w:val="VerbatimChar"/>
     <w:rPr>
-      <w:rFonts w:ascii="Consolas" w:eastAsia="Consolas" w:hAnsi="Consolas" w:cs="Consolas"/>
       <w:b/>
       <w:i/>
-      <w:color w:val="60A0B0"/>
-      <w:sz w:val="19"/>
+      <w:color w:val="60a0b0"/>
     </w:rPr>
   </w:style>
   <w:style w:type="character" w:customStyle="1" w:styleId="WarningTok">
     <w:name w:val="WarningTok"/>
     <w:basedOn w:val="VerbatimChar"/>
     <w:rPr>
-      <w:rFonts w:ascii="Consolas" w:eastAsia="Consolas" w:hAnsi="Consolas" w:cs="Consolas"/>
       <w:b/>
       <w:i/>
-      <w:color w:val="60A0B0"/>
-      <w:sz w:val="19"/>
+      <w:color w:val="60a0b0"/>
     </w:rPr>
   </w:style>
   <w:style w:type="character" w:customStyle="1" w:styleId="AlertTok">
     <w:name w:val="AlertTok"/>
     <w:basedOn w:val="VerbatimChar"/>
     <w:rPr>
-      <w:rFonts w:ascii="Consolas" w:eastAsia="Consolas" w:hAnsi="Consolas" w:cs="Consolas"/>
       <w:b/>
-      <w:color w:val="FF0000"/>
-      <w:sz w:val="19"/>
+      <w:color w:val="ff0000"/>
     </w:rPr>
   </w:style>
   <w:style w:type="character" w:customStyle="1" w:styleId="ErrorTok">
     <w:name w:val="ErrorTok"/>
     <w:basedOn w:val="VerbatimChar"/>
     <w:rPr>
-      <w:rFonts w:ascii="Consolas" w:eastAsia="Consolas" w:hAnsi="Consolas" w:cs="Consolas"/>
       <w:b/>
-      <w:color w:val="FF0000"/>
-      <w:sz w:val="19"/>
+      <w:color w:val="ff0000"/>
     </w:rPr>
   </w:style>
   <w:style w:type="character" w:customStyle="1" w:styleId="NormalTok">
     <w:name w:val="NormalTok"/>
     <w:basedOn w:val="VerbatimChar"/>
-    <w:rPr>
-      <w:rFonts w:ascii="Consolas" w:eastAsia="Consolas" w:hAnsi="Consolas" w:cs="Consolas"/>
-      <w:color w:val="5B2A63"/>
-      <w:sz w:val="19"/>
-    </w:rPr>
-  </w:style>
-  <w:style w:type="paragraph" w:styleId="Header">
-    <w:name w:val="header"/>
-    <w:basedOn w:val="Normal"/>
-    <w:link w:val="HeaderChar"/>
-    <w:rsid w:val="00A85B90"/>
-    <w:pPr>
-      <w:tabs>
-        <w:tab w:val="center" w:pos="4513"/>
-        <w:tab w:val="right" w:pos="9026"/>
-      </w:tabs>
-      <w:spacing w:after="0"/>
-    </w:pPr>
-  </w:style>
-  <w:style w:type="character" w:customStyle="1" w:styleId="HeaderChar">
-    <w:name w:val="Header Char"/>
-    <w:basedOn w:val="DefaultParagraphFont"/>
-    <w:link w:val="Header"/>
-    <w:rsid w:val="00A85B90"/>
-    <w:rPr>
-      <w:rFonts w:ascii="Segoe UI" w:eastAsia="Segoe UI" w:hAnsi="Segoe UI" w:cs="Segoe UI"/>
-      <w:color w:val="242424"/>
-      <w:sz w:val="21"/>
-    </w:rPr>
-  </w:style>
-  <w:style w:type="paragraph" w:styleId="Footer">
-    <w:name w:val="footer"/>
-    <w:basedOn w:val="Normal"/>
-    <w:link w:val="FooterChar"/>
-    <w:rsid w:val="00A85B90"/>
-    <w:pPr>
-      <w:tabs>
-        <w:tab w:val="center" w:pos="4513"/>
-        <w:tab w:val="right" w:pos="9026"/>
-      </w:tabs>
-      <w:spacing w:after="0"/>
-    </w:pPr>
-  </w:style>
-  <w:style w:type="character" w:customStyle="1" w:styleId="FooterChar">
-    <w:name w:val="Footer Char"/>
-    <w:basedOn w:val="DefaultParagraphFont"/>
-    <w:link w:val="Footer"/>
-    <w:rsid w:val="00A85B90"/>
-    <w:rPr>
-      <w:rFonts w:ascii="Segoe UI" w:eastAsia="Segoe UI" w:hAnsi="Segoe UI" w:cs="Segoe UI"/>
-      <w:color w:val="242424"/>
-      <w:sz w:val="21"/>
-    </w:rPr>
+    <w:rPr/>
   </w:style>
 </w:styles>
 </file>
@@ -2891,10 +2704,4 @@
     </a:ext>
   </a:extLst>
 </a:theme>
-</file>
-
-<file path=docMetadata/LabelInfo.xml><?xml version="1.0" encoding="utf-8"?>
-<clbl:labelList xmlns:clbl="http://schemas.microsoft.com/office/2020/mipLabelMetadata">
-  <clbl:label id="{f42aa342-8706-4288-bd11-ebb85995028c}" enabled="1" method="Standard" siteId="{72f988bf-86f1-41af-91ab-2d7cd011db47}" contentBits="0" removed="0"/>
-</clbl:labelList>
 </file>
</xml_diff>